<commit_message>
Report: wording fixes from the review; PDF re-exported from the docx
Keeps the author's Word edits of 2026-10-05. Corrects sentences that misread the
results (afternoon windows, raw-MW ARI, demand correlation, mutual information,
P2, the temperature U, the cause of the median miss), softens claims stronger
than the notebooks support, states that the reserve comparison is set and scored
on the same holdout hours, fixes four caption sources and two typos.
No number changed. Still 19 pages; every heading on the same page.
</commit_message>
<xml_diff>
--- a/reports/Milestone_II_Final_Report.docx
+++ b/reports/Milestone_II_Final_Report.docx
@@ -579,10 +579,7 @@
         <w:jc w:val="both"/>
       </w:pPr>
       <w:r>
-        <w:t xml:space="preserve">Three findings went against the project and are reported as such: the regime labels improve the point forecast by only 17.4 MW; 77% of duck days are California's; and the calibrated median sits at 0.538 rather than 0.500 because the holdout year drifted from the calibration year. The largest error, a 57,477 MW miss in MISO, is a data failure that can be flagged from the inputs alone. A reserve rule built on the regime-conditional band moves shortfall on duck-day evening ramps from 5.8% to 4.1% of hours for </w:t>
-      </w:r>
-      <w:r>
-        <w:t>3.7% more capacity; no monetary value is claimed. Figure 1 summarises the project on one page.</w:t>
+        <w:t>Three findings went against the project and are reported as such: the regime labels improve the point forecast by only 17.4 MW; 77% of duck days are California's; and the calibrated median sits at 0.538 rather than 0.500 because the holdout year drifted from the calibration year. The largest error, a 57,477 MW miss in MISO, is a data failure that can be flagged from the inputs alone. A reserve rule built on the regime-conditional band moves shortfall on duck-day evening ramps from 5.8% to 4.1% of hours for 3.7% more capacity; no monetary value is claimed. Figure 1 summarises the project on one page.</w:t>
       </w:r>
     </w:p>
     <w:p>
@@ -654,14 +651,7 @@
           <w:sz w:val="18"/>
           <w:szCs w:val="18"/>
         </w:rPr>
-        <w:t>The project on one page. Panels 1–3 state the problem: wind and solar grew from 16.6% to 26.2% of the six grids' generation, California's lowest midday net load fell from 13.7 GW (2019) to 9.9 GW (2024), and the EIA forecast covers only demand, so its wind-and-solar leg carries 2,770 MW of error against 1,048 MW for demand. Panels 4–6 state the answer: 2,140 MW day-ahead error against 4,260, 3,059 and 2,486 MW for the three benchmarks; the model's inputs; and a 90% band covering 88.7% of real hours. Source:</w:t>
-      </w:r>
-      <w:r>
-        <w:rPr>
-          <w:sz w:val="18"/>
-          <w:szCs w:val="18"/>
-        </w:rPr>
-        <w:t xml:space="preserve"> reports/overview/project_overview.png.</w:t>
+        <w:t xml:space="preserve">The project on one page. Panels 1–3 state the problem: wind and solar grew from 16.6% to 26.2% of the six grids' generation, California's lowest midday net load fell from 13.7 GW (2019) to 9.9 GW (2024), and the EIA forecast covers only demand, so its wind-and-solar leg carries 2,770 MW of error against 1,048 MW for demand. Panels 4–6 state the answer: 2,140 MW day-ahead error against 4,260, 3,059 and 2,486 MW for the three benchmarks; the model's inputs; and a 90% band covering 88.7% of real hours. Source: reports/figures/report/project_overview_in_report.png.</w:t>
       </w:r>
     </w:p>
     <w:p>
@@ -741,14 +731,7 @@
           <w:sz w:val="18"/>
           <w:szCs w:val="18"/>
         </w:rPr>
-        <w:t>The duck curve is a measurement</w:t>
-      </w:r>
-      <w:r>
-        <w:rPr>
-          <w:sz w:val="18"/>
-          <w:szCs w:val="18"/>
-        </w:rPr>
-        <w:t>. (a) California's median 2024 day in local time: demand (black), net load (orange) and the wedge wind and solar served. (b) The same profile for each year 2019–2024: the belly deepens and moves later. (c) Each day's steepest three-hour evening ramp, median and 95th-percentile day per year. (d) Every region's 2024 median profile divided by its own daily mean: only California has a deep midday belly. Source: notebook 00 §0.6 (00_duck_curve.png).</w:t>
+        <w:t>The duck curve is a measurement. (a) California's median 2024 day in local time: demand (black), net load (orange) and the wedge wind and solar served. (b) The same profile for each year 2019–2024: the belly deepens and moves later. (c) Each day's steepest three-hour evening ramp, median and 95th-percentile day per year. (d) Every region's 2024 median profile divided by its own daily mean: only California has a deep midday belly. Source: notebook 00 §0.6 (00_duck_curve.png).</w:t>
       </w:r>
     </w:p>
     <w:p>
@@ -758,22 +741,7 @@
       </w:pPr>
       <w:r>
         <w:lastRenderedPageBreak/>
-        <w:t xml:space="preserve">Every hour a grid operator must match generation to consumption exactly. Without wind or solar the day-ahead problem is essentially solved: demand follows the clock, the calendar and the temperature. Wind and solar are generation the operator does not schedule, so the plants it </w:t>
-      </w:r>
-      <w:r>
-        <w:t>does</w:t>
-      </w:r>
-      <w:r>
-        <w:t xml:space="preserve"> control must meet only net load, and that remainder sets how many plants to commit the evening before and how much reserve to hold. In California (Figure 2), demand on the median 2024 day moves by only 6,140 MW while net load swings 14,851 MW, from a belly of 9,947 MW at 14:00 to 24,798 MW at 21:00, and the steepest three-hour evening ramp on a median day rose 45% from 2019 to 2024. Commitment is decided on a forecast, which is why this project forecasts at 1, 24, 48 and 72 hours, and reserve is sized from</w:t>
-      </w:r>
-      <w:r>
-        <w:t xml:space="preserve"> the forecast </w:t>
-      </w:r>
-      <w:r>
-        <w:t>error</w:t>
-      </w:r>
-      <w:r>
-        <w:t>. No model can flatten the duck curve; a better forecast can make standing ready for it cheaper.</w:t>
+        <w:t>Every hour a grid operator must match generation to consumption exactly. Without wind or solar the day-ahead problem is essentially solved: demand follows the clock, the calendar and the temperature. Wind and solar are generation the operator does not schedule, so the plants it does control must meet only net load, and that remainder sets how many plants to commit the evening before and how much reserve to hold. In California (Figure 2), demand on the median 2024 day moves by only 6,140 MW while net load swings 14,851 MW, from a belly of 9,947 MW at 14:00 to 24,798 MW at 21:00, and the steepest three-hour evening ramp on a median day rose 45% from 2019 to 2024. Commitment is decided on a forecast, which is why this project forecasts at 1, 24, 48 and 72 hours, and reserve is sized from the forecast error. No model can flatten the duck curve; a better forecast can make standing ready for it cheaper.</w:t>
       </w:r>
     </w:p>
     <w:tbl>
@@ -1238,7 +1206,7 @@
           <w:sz w:val="18"/>
           <w:szCs w:val="18"/>
         </w:rPr>
-        <w:t>, so a skill of 0.5 means half the benchmark's error. Source: notebook 04 §4.3, §4.8, §4.9b; notebook 06 §6.2; notebook 08 §8.12.</w:t>
+        <w:t xml:space="preserve">, so a skill of 0.5 means half the benchmark's error. Source: notebook 04 §4.3, §4.8, §4.9b; notebook 06 §6.2; notebook 08 §8.10.</w:t>
       </w:r>
     </w:p>
     <w:p>
@@ -1256,25 +1224,7 @@
         <w:t xml:space="preserve"> </w:t>
       </w:r>
       <w:r>
-        <w:t xml:space="preserve">Every result is scored on the same held-out hours against three benchmarks, each harder than the last: </w:t>
-      </w:r>
-      <w:r>
-        <w:t>seasonal naive</w:t>
-      </w:r>
-      <w:r>
-        <w:t xml:space="preserve">, the same hour one week earlier (4,259.8 MW off); the </w:t>
-      </w:r>
-      <w:r>
-        <w:t>EIA composite</w:t>
-      </w:r>
-      <w:r>
-        <w:t xml:space="preserve">, the EIA's day-ahead demand forecast minus the previous day's wind and solar (3,059.2 MW); and a </w:t>
-      </w:r>
-      <w:r>
-        <w:t>strengthened composite v2</w:t>
-      </w:r>
-      <w:r>
-        <w:t xml:space="preserve"> whose wind leg is replaced by a weather regression (2,485.9 MW). The EIA's own forecast is good </w:t>
+        <w:t xml:space="preserve">Every result is scored on the same held-out hours against three benchmarks, each harder than the last: seasonal naive, the same hour one week earlier (4,259.8 MW off); the EIA composite, the EIA's day-ahead demand forecast minus the previous day's wind and solar (3,059.2 MW); and a strengthened composite v2 whose wind leg is replaced by a weather regression (2,485.9 MW). The EIA's own forecast is good </w:t>
       </w:r>
       <w:proofErr w:type="gramStart"/>
       <w:r>
@@ -1291,10 +1241,7 @@
         <w:jc w:val="both"/>
       </w:pPr>
       <w:r>
-        <w:t>GEFCom2014 set the reference for probabilistic load forecasting on the pinball loss [11]; this project forecasts net load for six balancing authorities and calibrates its quantiles per region with conformal prediction [3, 4]. Kaur et al. [12] found that forecasting net load directly beat forecasting load and solar separately; Denholm et al. [14] analyse the duck chart as California's problem, and Section 2 finds it in one grid of six; Ruggles et al. [15] impute EIA-930 gaps where this project abstains; Hong</w:t>
-      </w:r>
-      <w:r>
-        <w:t xml:space="preserve"> et al. [16] show weather-station choice moves accuracy, the basis for the first upgrade in Section 9.</w:t>
+        <w:t>GEFCom2014 set the reference for probabilistic load forecasting on the pinball loss [11]; this project forecasts net load for six balancing authorities and calibrates its quantiles per region with conformal prediction [3, 4]. Kaur et al. [12] found that forecasting net load directly beat forecasting load and solar separately; Denholm et al. [14] analyse the duck chart as California's problem, and Section 2 finds it in one grid of six; Ruggles et al. [15] impute EIA-930 gaps where this project abstains; Hong et al. [16] show weather-station choice moves accuracy, the basis for the first upgrade in Section 9.</w:t>
       </w:r>
     </w:p>
     <w:p>
@@ -1303,37 +1250,7 @@
         <w:jc w:val="both"/>
       </w:pPr>
       <w:r>
-        <w:t xml:space="preserve">Goals were fixed before any model ran and two were later made stricter (Table 1). Five predictions were also registered in notebook 01, before the supervised notebook existed: </w:t>
-      </w:r>
-      <w:r>
-        <w:t>P1</w:t>
-      </w:r>
-      <w:r>
-        <w:t xml:space="preserve"> MAE rises with the horizon and the largest step is h=1 → h=24; </w:t>
-      </w:r>
-      <w:r>
-        <w:t>P2</w:t>
-      </w:r>
-      <w:r>
-        <w:t xml:space="preserve"> the weekly lag overtakes the daily lag in importance as the horizon lengthens; </w:t>
-      </w:r>
-      <w:r>
-        <w:t>P3</w:t>
-      </w:r>
-      <w:r>
-        <w:t xml:space="preserve"> MAE is worst in the evening ramp hours (17:00–21:00 local); </w:t>
-      </w:r>
-      <w:r>
-        <w:t>P4</w:t>
-      </w:r>
-      <w:r>
-        <w:t xml:space="preserve"> scaled error is highest in the Plains and lowest in New York; </w:t>
-      </w:r>
-      <w:r>
-        <w:t>P5</w:t>
-      </w:r>
-      <w:r>
-        <w:t xml:space="preserve"> the weather family's share of importance rises with the horizon. Three held and two failed (Section 5.4).</w:t>
+        <w:t>Goals were fixed before any model ran and two were later made stricter (Table 1). Five predictions were also registered in notebook 01, before the supervised notebook existed: P1 MAE rises with the horizon and the largest step is h=1 → h=24; P2 the weekly lag overtakes the daily lag in importance as the horizon lengthens; P3 MAE is worst in the evening ramp hours (17:00–21:00 local); P4 scaled error is highest in the Plains and lowest in New York; P5 the weather family's share of importance rises with the horizon. Three held and two failed (Section 5.4).</w:t>
       </w:r>
     </w:p>
     <w:p>
@@ -1360,22 +1277,7 @@
         <w:jc w:val="both"/>
       </w:pPr>
       <w:r>
-        <w:t xml:space="preserve">Three public sources were combined. </w:t>
-      </w:r>
-      <w:r>
-        <w:t>EIA-930</w:t>
-      </w:r>
-      <w:r>
-        <w:t xml:space="preserve"> [1] reports, per balancing authority and hour, metered demand, the operator-submitted day-ahead demand forecast and generation by fuel: lagged demand is an input, the forecast is the benchmark, and demand minus wind minus solar defines the target. </w:t>
-      </w:r>
-      <w:r>
-        <w:t>ERA5 reanalysis</w:t>
-      </w:r>
-      <w:r>
-        <w:t xml:space="preserve"> from Open-Meteo [2] supplies fifteen hourly weather variables at one population-weighted point per region, and </w:t>
-      </w:r>
-      <w:r>
-        <w:t>Open-</w:t>
+        <w:t>Three public sources were combined. EIA-930 [1] reports, per balancing authority and hour, metered demand, the operator-submitted day-ahead demand forecast and generation by fuel: lagged demand is an input, the forecast is the benchmark, and demand minus wind minus solar defines the target. ERA5 reanalysis from Open-Meteo [2] supplies fifteen hourly weather variables at one population-weighted point per region, and Open-</w:t>
       </w:r>
       <w:proofErr w:type="gramStart"/>
       <w:r>
@@ -1383,10 +1285,7 @@
       </w:r>
       <w:proofErr w:type="gramEnd"/>
       <w:r>
-        <w:t xml:space="preserve"> forecasts</w:t>
-      </w:r>
-      <w:r>
-        <w:t xml:space="preserve"> supply six of them as they were forecast one to three days ahead over the holdout year (Section 7.5). The raw panel is 315,648 rows (6 zones × 52,608 hours).</w:t>
+        <w:t xml:space="preserve"> forecasts supply six of them as they were forecast one to three days ahead over the holdout year (Section 7.5). The raw panel is 315,648 rows (6 zones × 52,608 hours).</w:t>
       </w:r>
     </w:p>
     <w:p>
@@ -1396,10 +1295,7 @@
       </w:pPr>
       <w:r>
         <w:lastRenderedPageBreak/>
-        <w:t>Six balancing authorities were chosen for contrast (Table 2): they differ by a factor of ten in size, nine in renewable share, and in the shape of the day itself; only California has an afternoon solar belly, while the others trough overnight. Pre-registered cleaning nulled twelve impossible values and interpolated short gaps, and dropped four 24-hour demand outages (one in MISO from 2024-07-01 06:00) plus 67 further rows, 163 rows in all (0.052%), leaving 315,485. The split is chronological: the holdout be</w:t>
-      </w:r>
-      <w:r>
-        <w:t>gins on 2024-02-07, so it holds no January, and it is 2.16 °C warmer than the development block; Section 5.2 addresses the missing winter with rolling-origin refits.</w:t>
+        <w:t>Six balancing authorities were chosen for contrast (Table 2): they differ by a factor of ten in size, nine in renewable share, and in the shape of the day itself; only California has an afternoon solar belly, while the others trough overnight. Pre-registered cleaning nulled twelve impossible values and interpolated short gaps, and dropped four 24-hour demand outages (one in MISO from 2024-07-01 06:00) plus 67 further rows, 163 rows in all (0.052%), leaving 315,485. The split is chronological: the holdout begins on 2024-02-07, so it holds no January, and it is 2.16 °C warmer than the development block; Section 5.2 addresses the missing winter with rolling-origin refits.</w:t>
       </w:r>
     </w:p>
     <w:tbl>
@@ -2454,7 +2350,7 @@
         <w:t>apparent_temp</w:t>
       </w:r>
       <w:r>
-        <w:t xml:space="preserve"> has the highest mutual information of any meteorological column (0.247) while its correlation is 0.003. Hub-height wind beats the 10 m reading in five of six zones, and the curve flattens near the rated speed, which is the turbine power curve appearing in the data. Only Bonneville gets worse, because its weather point is Portland and its turbines are in the Columbia Gorge: the cost of one weather point per region, measured.</w:t>
+        <w:t xml:space="preserve"> has the highest mutual information of any meteorological column after surface pressure (0.247) while its correlation is 0.003. Hub-height wind beats the 10 m reading in five of six zones, and the curve flattens near the rated speed, which is the turbine power curve appearing in the data. Only Bonneville gets worse, because its weather point is Portland and its turbines are in the Columbia Gorge: the cost of one weather point per region, measured.</w:t>
       </w:r>
     </w:p>
     <w:p>
@@ -2660,13 +2556,7 @@
         <w:jc w:val="both"/>
       </w:pPr>
       <w:r>
-        <w:t>The supervised and unsupervised arms share everything up to and including the feature pipeline (Figure 5) and diverge only at notebooks 04 and 05; they are reunited in notebook 07, where a surrogate tree explains the clusters with the forecaster's inputs, and in the uncertainty arm, which conditions its reserve rule on the regimes. The comparison is fair because the protocol is shared: the same 315,485-row panel, the same five expanding chronological folds with a 191-hour gap at h=24 (168 hours for the long</w:t>
-      </w:r>
-      <w:r>
-        <w:t>est rolling window plus the horizon minus one), and the same sealed holdout of 47,299 rows. A random split of hourly rows would place a training hour next to a validation hour that is 0.976 correlated with it and report an error no operator could reproduce. A pooled model with zone identity as a feature was chosen over six per-zone models because the lags carry each zone's level and the small zones have too little variation to tune separately; deep sequence models were rejected for a tabular problem of 57 f</w:t>
-      </w:r>
-      <w:r>
-        <w:t>eatures where tree ensembles are the established frontier and interpretability is required.</w:t>
+        <w:t>The supervised and unsupervised arms share everything up to and including the feature pipeline (Figure 5) and diverge only at notebooks 04 and 05; they are reunited in notebook 07, where a surrogate tree explains the clusters with the forecaster's inputs, and in the uncertainty arm, which conditions its reserve rule on the regimes. The comparison is fair because the protocol is shared: the same 315,485-row panel, the same five expanding chronological folds with a 191-hour gap at h=24 (168 hours for the longest rolling window plus the horizon minus one), and the same sealed holdout of 47,299 rows. A random split of hourly rows would place a training hour next to a validation hour that is 0.976 correlated with it and report an error no operator could reproduce. A pooled model with zone identity as a feature was chosen over six per-zone models because the lags carry each zone's level and the small zones have too little variation to tune separately; deep sequence models were rejected for a tabular problem of 57 features where tree ensembles are the established frontier and interpretability is required.</w:t>
       </w:r>
     </w:p>
     <w:p>
@@ -2875,7 +2765,7 @@
         <w:t xml:space="preserve">A unit test now fails if any unvetted column becomes a feature. Second, a trailing </w:t>
       </w:r>
       <w:r>
-        <w:t>means</w:t>
+        <w:t xml:space="preserve">mean</w:t>
       </w:r>
       <w:r>
         <w:t xml:space="preserve"> computed as </w:t>
@@ -2915,10 +2805,7 @@
       </w:r>
       <w:proofErr w:type="gramEnd"/>
       <w:r>
-        <w:t xml:space="preserve"> into hours the operator has not lived through. Measured: admissible and leaked arms are identical at h=1 (538.8 MW each), but the leaked model scores 1,874.8 against the admissible 2,173.2 MW at h=24 (optimism 298.4 MW, 13.7%) and 1,890.1 against 2,615.1 MW at h=72 (725.1 MW, 27.7%). The leaked model degrades by only 15.3 MW from h=24 to h=72 against the admissible 442.0 MW; it erased the horizon signal, and a check at h=1 alo</w:t>
-      </w:r>
-      <w:r>
-        <w:t>ne would have found nothing.</w:t>
+        <w:t xml:space="preserve"> into hours the operator has not lived through. Measured: admissible and leaked arms are identical at h=1 (538.8 MW each), but the leaked model scores 1,874.8 against the admissible 2,173.2 MW at h=24 (optimism 298.4 MW, 13.7%) and 1,890.1 against 2,615.1 MW at h=72 (725.1 MW, 27.7%). The leaked model degrades by only 15.3 MW from h=24 to h=72 against the admissible 442.0 MW; it erased the horizon signal, and a check at h=1 alone would have found nothing.</w:t>
       </w:r>
     </w:p>
     <w:p>
@@ -2986,14 +2873,7 @@
           <w:sz w:val="18"/>
           <w:szCs w:val="18"/>
         </w:rPr>
-        <w:t>Two leaks, measured before removal. (a) the sum of the nine same-hour fuel columns against net load per region, with the 45° identity line; Texas (r = 0.9997), the Plains and MISO lie on it, and New York (r = 0.9518) sits just below it. (b) cross-validated MAE by horizon with rolling windows ending at the forecast origin (admissible) against windows ending the hour before the target (leaked): the arms coincide at h=1 and the leaked model's error barely moves with the horizon because it is reading part of th</w:t>
-      </w:r>
-      <w:r>
-        <w:rPr>
-          <w:sz w:val="18"/>
-          <w:szCs w:val="18"/>
-        </w:rPr>
-        <w:t>e answer. Source: notebook 02 §2.15; notebook 04 §4.2 (02_leakage_fuel_columns.png; 04_leak_cost.png).</w:t>
+        <w:t>Two leaks, measured before removal. (a) the sum of the nine same-hour fuel columns against net load per region, with the 45° identity line; Texas (r = 0.9997), the Plains and MISO lie on it, and New York (r = 0.9518) sits just below it. (b) cross-validated MAE by horizon with rolling windows ending at the forecast origin (admissible) against windows ending the hour before the target (leaked): the arms coincide at h=1 and the leaked model's error barely moves with the horizon because it is reading part of the answer. Source: notebook 02 §2.15; notebook 04 §4.2 (02_leakage_fuel_columns.png; 04_leak_cost.png).</w:t>
       </w:r>
     </w:p>
     <w:p>
@@ -3011,43 +2891,7 @@
         <w:jc w:val="both"/>
       </w:pPr>
       <w:r>
-        <w:t xml:space="preserve">Six feature families are computed inside the pipeline: </w:t>
-      </w:r>
-      <w:r>
-        <w:t>target lags</w:t>
-      </w:r>
-      <w:r>
-        <w:t xml:space="preserve"> at the horizon's lag set; </w:t>
-      </w:r>
-      <w:r>
-        <w:t>rolling statistics</w:t>
-      </w:r>
-      <w:r>
-        <w:t xml:space="preserve"> (24- and 168-hour trailing mean and standard deviation ending at the origin); </w:t>
-      </w:r>
-      <w:r>
-        <w:t>calendar</w:t>
-      </w:r>
-      <w:r>
-        <w:t xml:space="preserve"> (hour, weekday, month, weekend, a year-end holiday proxy, with sine and cosine encodings); </w:t>
-      </w:r>
-      <w:r>
-        <w:t>weather</w:t>
-      </w:r>
-      <w:r>
-        <w:t xml:space="preserve"> (fifteen ERA5 columns plus heating and cooling degree terms and a per-zone clear-sky index); </w:t>
-      </w:r>
-      <w:r>
-        <w:t>exogenous lags</w:t>
-      </w:r>
-      <w:r>
-        <w:t xml:space="preserve"> (lagged demand and fuel columns); and </w:t>
-      </w:r>
-      <w:r>
-        <w:t>zone</w:t>
-      </w:r>
-      <w:r>
-        <w:t xml:space="preserve"> (one-hot identity plus the lags expressed as ratios to the zone's trailing 168-hour level). Missing values are imputed by the training-fold median.</w:t>
+        <w:t>Six feature families are computed inside the pipeline: target lags at the horizon's lag set; rolling statistics (24- and 168-hour trailing mean and standard deviation ending at the origin); calendar (hour, weekday, month, weekend, a year-end holiday proxy, with sine and cosine encodings); weather (fifteen ERA5 columns plus heating and cooling degree terms and a per-zone clear-sky index); exogenous lags (lagged demand and fuel columns); and zone (one-hot identity plus the lags expressed as ratios to the zone's trailing 168-hour level). Missing values are imputed by the training-fold median.</w:t>
       </w:r>
     </w:p>
     <w:p>
@@ -3065,13 +2909,7 @@
         <w:t>select__k = all</w:t>
       </w:r>
       <w:r>
-        <w:t xml:space="preserve">): the forward-selection curve has no knee, and the 39 </w:t>
-      </w:r>
-      <w:r>
-        <w:t>lowest-ranked</w:t>
-      </w:r>
-      <w:r>
-        <w:t xml:space="preserve"> features are jointly worth 61.95 MW. Mutual information scores </w:t>
+        <w:t xml:space="preserve">): the forward-selection curve has no knee, and the 39 lowest-ranked features are jointly worth 61.95 MW. Mutual information scores </w:t>
       </w:r>
       <w:proofErr w:type="gramStart"/>
       <w:r>
@@ -3079,19 +2917,7 @@
       </w:r>
       <w:proofErr w:type="gramEnd"/>
       <w:r>
-        <w:t xml:space="preserve"> </w:t>
-      </w:r>
-      <w:r>
-        <w:t>marginally</w:t>
-      </w:r>
-      <w:r>
-        <w:t xml:space="preserve">, while the model uses them </w:t>
-      </w:r>
-      <w:r>
-        <w:t>conditionally</w:t>
-      </w:r>
-      <w:r>
-        <w:t xml:space="preserve"> (</w:t>
+        <w:t xml:space="preserve"> marginally, while the model uses them conditionally (</w:t>
       </w:r>
       <w:r>
         <w:rPr>
@@ -3118,13 +2944,7 @@
         <w:jc w:val="both"/>
       </w:pPr>
       <w:r>
-        <w:t xml:space="preserve">Four benchmarks bound the results: seasonal naive, persistence (1,211.9 MW, fair at h=1 only), the EIA composite v1 and composite v2. The supervised ladder climbs from ordinary least squares, to ridge, to a random forest, to histogram gradient boosting [18] (the champion), to a quantile gradient-boosting model that produces the seven quantiles Section 7 needs, each rung justified by a failure of the one below. Tuning searched the </w:t>
-      </w:r>
-      <w:r>
-        <w:t>whole pipeline</w:t>
-      </w:r>
-      <w:r>
-        <w:t xml:space="preserve">, </w:t>
+        <w:t xml:space="preserve">Four benchmarks bound the results: seasonal naive, persistence (1,211.9 MW, fair at h=1 only), the EIA composite v1 and composite v2. The supervised ladder climbs from ordinary least squares, to ridge, to a random forest, to histogram gradient boosting [18] (the champion), to a quantile gradient-boosting model that produces the seven quantiles Section 7 needs, each rung justified by a failure of the one below. Tuning searched the whole pipeline, </w:t>
       </w:r>
       <w:r>
         <w:lastRenderedPageBreak/>
@@ -3137,10 +2957,7 @@
         <w:t>MAE</w:t>
       </w:r>
       <w:r>
-        <w:t xml:space="preserve"> in megawatts, the unit reserve is procured in; RMSE was set aside because the error distribution is heavy-tailed, and MAPE because minimising it pulls forecasts low. Model differences are tested with Diebold–Mariano [7] and Wilcoxon signed-rank tests on 1,974 zone-day blocks with Benjamini–Hochberg correction [10], because hourly residuals are autocorrelated at 0.95. Intervals are scored by coverage, width and the Winkler score [6]; clusters by adjusted Rand index (ARI) [20] stability under 80% resampling;</w:t>
-      </w:r>
-      <w:r>
-        <w:t xml:space="preserve"> the classifier by PR-AUC against its base rate.</w:t>
+        <w:t xml:space="preserve"> in megawatts, the unit reserve is procured in; RMSE was set aside because the error distribution is heavy-tailed, and MAPE because minimising it pulls forecasts low. Model differences are tested with Diebold–Mariano [7] and Wilcoxon signed-rank tests on 1,974 zone-day blocks with Benjamini–Hochberg correction [10], because hourly residuals are autocorrelated at 0.95. Intervals are scored by coverage, width and the Winkler score [6]; clusters by adjusted Rand index (ARI) [20] stability under 80% resampling; the classifier by PR-AUC against its base rate.</w:t>
       </w:r>
     </w:p>
     <w:p>
@@ -3158,13 +2975,7 @@
         <w:jc w:val="both"/>
       </w:pPr>
       <w:r>
-        <w:t xml:space="preserve">The unsupervised question is about </w:t>
-      </w:r>
-      <w:r>
-        <w:t>shape</w:t>
-      </w:r>
-      <w:r>
-        <w:t>, so each zone-day was expressed as 24 local-hour values normalised within the day to [0, 1] (13,069 zone-days × 24); local hours matter because the six systems' solar noons differ by up to three hours in UTC. The matrix was reduced by PCA, and k-means, Ward's clustering and DBSCAN were tuned on 3, 5 and 8 components, 39 grid cells in all. The partition was chosen by ARI stability, validated against weather the clustering never saw, and tested as a feature in the forecaster.</w:t>
+        <w:t>The unsupervised question is about shape, so each zone-day was expressed as 24 local-hour values normalised within the day to [0, 1] (13,069 zone-days × 24); local hours matter because the six systems' solar noons differ by up to three hours in UTC. The matrix was reduced by PCA, and k-means, Ward's clustering and DBSCAN were tuned on 3, 5 and 8 components, 39 grid cells in all. The partition was chosen by ARI stability, validated against weather the clustering never saw, and tested as a feature in the forecaster.</w:t>
       </w:r>
     </w:p>
     <w:p>
@@ -3173,10 +2984,7 @@
         <w:jc w:val="both"/>
       </w:pPr>
       <w:r>
-        <w:t>Prediction intervals come from a quantile gradient-boosting model at seven levels (0.05 to 0.95) on the champion's feature set, repaired and calibrated in three measured steps: monotone rearrangement [19] to remove quantile crossing; a chronological split of the development block at 2023-01-30 into a fit block and a calibration block; and nine interval constructions compared on the holdout, from split conformal and conformalised quantile regression (CQR) [3] to Mondrian versions conditioned on zone [4]. The</w:t>
-      </w:r>
-      <w:r>
-        <w:t xml:space="preserve"> shipped arm is CQR additive, Mondrian by zone.</w:t>
+        <w:t>Prediction intervals come from a quantile gradient-boosting model at seven levels (0.05 to 0.95) on the champion's feature set, repaired and calibrated in three measured steps: monotone rearrangement [19] to remove quantile crossing; a chronological split of the development block at 2023-01-30 into a fit block and a calibration block; and nine interval constructions compared on the holdout, from split conformal and conformalised quantile regression (CQR) [3] to Mondrian versions conditioned on zone [4]. The shipped arm is CQR additive, Mondrian by zone.</w:t>
       </w:r>
     </w:p>
     <w:p>
@@ -3203,13 +3011,7 @@
         <w:jc w:val="both"/>
       </w:pPr>
       <w:r>
-        <w:t xml:space="preserve">Figure 7 reports all 39 grid cells. K-means is stable at every k (never below 0.90) and Ward much less so (below the 0.6 goal for most cells); DBSCAN finds structure but pays in noise, because a manifold without density gaps is the wrong problem for it. Silhouette, Davies–Bouldin and Calinski–Harabasz agree, so </w:t>
-      </w:r>
-      <w:r>
-        <w:t>all four metrics pick k=3</w:t>
-      </w:r>
-      <w:r>
-        <w:t>. The chosen configuration, k-means with k=3 on 5 principal components keeping 94.8% of the shape variance, scores ARI 0.996 and silhouette 0.429. Clustering raw megawatts instead gives ARI −0.034 and a cluster that is 92% MISO, so the partition is about shape.</w:t>
+        <w:t xml:space="preserve">Figure 7 reports all 39 grid cells. K-means is stable at every k (never below 0.90) and Ward much less so (below the 0.6 goal for most cells); DBSCAN finds structure but pays in noise, because a manifold without density gaps is the wrong problem for it. Silhouette, Davies–Bouldin and Calinski–Harabasz agree, so all four metrics pick k=3. The chosen configuration, k-means with k=3 on 5 principal components keeping 94.8% of the shape variance, scores ARI 0.996 and silhouette 0.429. Clustering raw megawatts instead agrees with this partition at ARI −0.034, no better than chance, and gives a cluster that is 92% MISO, so the partition is about shape.</w:t>
       </w:r>
     </w:p>
     <w:p>
@@ -3227,25 +3029,7 @@
         <w:jc w:val="both"/>
       </w:pPr>
       <w:r>
-        <w:t xml:space="preserve">The centroids (Figure 7d) are three different shapes, not three depths of one shape. </w:t>
-      </w:r>
-      <w:r>
-        <w:t>Cluster 2 (n = 2,791, 21.4%) is the duck</w:t>
-      </w:r>
-      <w:r>
-        <w:t xml:space="preserve">: minimum at local hour 13, evening ramp 0.841, the steepest. </w:t>
-      </w:r>
-      <w:r>
-        <w:t>Cluster 1 (n = 7,782, 59.5%) is the conventional day</w:t>
-      </w:r>
-      <w:r>
-        <w:t xml:space="preserve">: minimum at hour 4, ramp 0.364. </w:t>
-      </w:r>
-      <w:r>
-        <w:t>Cluster 0 (n = 2,496, 19.1%) is winter-shaped</w:t>
-      </w:r>
-      <w:r>
-        <w:t>: a morning peak, an afternoon decline, minimum at hour 23, ramp 0.173. The names were derived from the centroids and then required to pass a weather check.</w:t>
+        <w:t>The centroids (Figure 7d) are three different shapes, not three depths of one shape. Cluster 2 (n = 2,791, 21.4%) is the duck: minimum at local hour 13, evening ramp 0.841, the steepest. Cluster 1 (n = 7,782, 59.5%) is the conventional day: minimum at hour 4, ramp 0.364. Cluster 0 (n = 2,496, 19.1%) is winter-shaped: a morning peak, an afternoon decline, minimum at hour 23, ramp 0.173. The names were derived from the centroids and then required to pass a weather check.</w:t>
       </w:r>
     </w:p>
     <w:p>
@@ -3337,13 +3121,7 @@
         <w:jc w:val="both"/>
       </w:pPr>
       <w:r>
-        <w:t xml:space="preserve">Not one weather column enters the clustering, so weather separating across regimes would be external corroboration. But are the regimes zones in disguise (Figure 8a)? Substantially, yes. </w:t>
-      </w:r>
-      <w:r>
-        <w:t>77% of all duck days (2,148 of 2,791) are California's, and 98% of California's days are duck days.</w:t>
-      </w:r>
-      <w:r>
-        <w:t xml:space="preserve"> Within </w:t>
+        <w:t xml:space="preserve">Not one weather column enters the clustering, so weather separating across regimes would be external corroboration. But are the regimes zones in disguise (Figure 8a)? Substantially, yes. 77% of all duck days (2,148 of 2,791) are California's, and 98% of California's days are duck days. Within </w:t>
       </w:r>
       <w:proofErr w:type="gramStart"/>
       <w:r>
@@ -3437,16 +3215,7 @@
       </w:pPr>
       <w:r>
         <w:lastRenderedPageBreak/>
-        <w:t xml:space="preserve">Adding yesterday's regime label to the champion's pipeline under identical folds (Figure 8b) lowers cross-validated MAE from 2,173.2 to 2,155.8 MW, −17.4 MW (paired p = 0.030); the label two days back gives nothing measurable, and today's own label, a deliberate leak kept as a control, −30.6 MW. The ordering is right and the gain is small, under 1%: the lags already carry most of what a shape label could add. A depth-3 surrogate tree predicting the regime from weather and calendar reaches balanced accuracy </w:t>
-      </w:r>
-      <w:r>
-        <w:t xml:space="preserve">0.627 against chance 0.333, splitting first on temperature. The honest answer to Q3 is that the regimes are stable and physically meaningful in their temperature signature, and useful mainly as a </w:t>
-      </w:r>
-      <w:r>
-        <w:t>conditioning variable for uncertainty</w:t>
-      </w:r>
-      <w:r>
-        <w:t xml:space="preserve"> (Section 7.6) rather than as a point-forecast feature.</w:t>
+        <w:t>Adding yesterday's regime label to the champion's pipeline under identical folds (Figure 8b) lowers cross-validated MAE from 2,173.2 to 2,155.8 MW, −17.4 MW (paired p = 0.030); the label two days back gives nothing measurable, and today's own label, a deliberate leak kept as a control, −30.6 MW. The ordering is right and the gain is small, under 1%: the lags already carry most of what a shape label could add. A depth-3 surrogate tree predicting the regime from weather and calendar reaches balanced accuracy 0.627 against chance 0.333, splitting first on temperature. The honest answer to Q3 is that the regimes are stable and physically meaningful in their temperature signature, and useful mainly as a conditioning variable for uncertainty (Section 7.6) rather than as a point-forecast feature.</w:t>
       </w:r>
     </w:p>
     <w:p>
@@ -4422,17 +4191,11 @@
         <w:jc w:val="both"/>
       </w:pPr>
       <w:r>
-        <w:t xml:space="preserve">Table 4 and Figure 11 judge the goals region by region. G1 and G2 are met everywhere. Against the strengthened composite the champion wins in five regions; in New York the composite's 641.1 MW beats the model's 709.7, but the paired interval for that gap, [−60.7, +164.5] MW, contains zero. This is the section's central finding: </w:t>
-      </w:r>
-      <w:r>
-        <w:t xml:space="preserve">the model's </w:t>
+        <w:t xml:space="preserve">Table 4 and Figure 11 judge the goals region by region. G1 and G2 are met everywhere. Against the strengthened composite the champion wins in five regions; in New York the composite's 641.1 MW beats the model's 709.7, but the paired interval for that gap, [−60.7, +164.5] MW, contains zero. This is the section's central finding: the model's </w:t>
       </w:r>
       <w:r>
         <w:lastRenderedPageBreak/>
-        <w:t>advantage is an advantage in forecasting the renewable term.</w:t>
-      </w:r>
-      <w:r>
-        <w:t xml:space="preserve"> California, where solar is half of midday demand, gains a third of its error (1,454.4 against 2,121.5 MW); New York, where net load is demand, gains nothing. The Plains carry the highest scaled error (14.6% of mean load), yet the model beats every benchmark there, so the difficulty sits in the wind corridor itself.</w:t>
+        <w:t xml:space="preserve">advantage appears to come from forecasting the renewable term. California, where solar is half of midday demand, gains a third of its error (1,454.4 against 2,121.5 MW); New York, where net load is demand, gains nothing. The Plains carry the highest scaled error (14.6% of mean load), yet the model beats every benchmark there, so the difficulty sits in the wind corridor itself.</w:t>
       </w:r>
     </w:p>
     <w:tbl>
@@ -5378,14 +5141,7 @@
                 <w:sz w:val="17"/>
                 <w:szCs w:val="17"/>
               </w:rPr>
-              <w:t>−</w:t>
-            </w:r>
-            <w:r>
-              <w:rPr>
-                <w:sz w:val="17"/>
-                <w:szCs w:val="17"/>
-              </w:rPr>
-              <w:t>11% (v2: 641.1 MW; paired gap [−60.7, +164.5])</w:t>
+              <w:t>−11% (v2: 641.1 MW; paired gap [−60.7, +164.5])</w:t>
             </w:r>
           </w:p>
         </w:tc>
@@ -5518,7 +5274,7 @@
           <w:sz w:val="18"/>
           <w:szCs w:val="18"/>
         </w:rPr>
-        <w:t>(a) Day-ahead holdout MAE per region for seasonal naive, the EIA composite, composite v2 and the champion, labelled with the champion's skill over composite v2. (b) The goals of Table 1 judged region by region, green met and red missed; the bottom row is the reserve headroom of Section 7.6. What to observe: the margin over the strengthened composite is largest where solar is largest and vanishes where net load is demand. Source: scripts/region_chapter.py from notebook 08 §8.16 (11_region_skill.png).</w:t>
+        <w:t xml:space="preserve">(a) Day-ahead holdout MAE per region for seasonal naive, the EIA composite, composite v2 and the champion, labelled with the champion's skill over composite v2. (b) The goals of Table 1 judged region by region, green met and red missed; the bottom row is the h=24 reserve saving of notebook 08 §8.6b. What to observe: the margin over the strengthened composite is largest where solar is largest and vanishes where net load is demand. Source: notebook 08 §8.16 (region_results.png).</w:t>
       </w:r>
     </w:p>
     <w:p>
@@ -5551,7 +5307,7 @@
         <w:t>P2 fails</w:t>
       </w:r>
       <w:r>
-        <w:t xml:space="preserve">: the weekly lag does not overtake the daily anchor in permutation importance (258.2 against 251.5 MW at h=24, 275.7 against 289.9 at h=72). </w:t>
+        <w:t xml:space="preserve">, in reverse: in permutation importance the weekly lag leads the daily anchor at h=24 (258.2 against 251.5 MW), not at h=72 (275.7 against 289.9). </w:t>
       </w:r>
       <w:r>
         <w:rPr>
@@ -5641,35 +5397,11 @@
         <w:t>zone_is_MISO</w:t>
       </w:r>
       <w:r>
-        <w:t xml:space="preserve"> 798.3. For a non-specialist, </w:t>
-      </w:r>
-      <w:r>
-        <w:t>this is a persistence model with corrections</w:t>
-      </w:r>
-      <w:r>
-        <w:t xml:space="preserve">: the best predictor of net </w:t>
+        <w:t xml:space="preserve"> 798.3. For a non-specialist, this is a persistence model with corrections: the best predictor of net </w:t>
       </w:r>
       <w:r>
         <w:lastRenderedPageBreak/>
-        <w:t xml:space="preserve">load tomorrow at 18:00 is net load today at 18:00, and weather and calendar refine it. Ablation answers a different question: removing a family and </w:t>
-      </w:r>
-      <w:r>
-        <w:t>refitting</w:t>
-      </w:r>
-      <w:r>
-        <w:t xml:space="preserve"> costs +698.1 MW for weather but only +66.0 MW for the target lags, because refitting leaves near-substitutes standing (lagged demand correlates at about 0.96 with the target). Permutation measures what </w:t>
-      </w:r>
-      <w:r>
-        <w:t>this fitted model</w:t>
-      </w:r>
-      <w:r>
-        <w:t xml:space="preserve"> leans on; ablation measures what the model </w:t>
-      </w:r>
-      <w:r>
-        <w:t>could not do without</w:t>
-      </w:r>
-      <w:r>
-        <w:t xml:space="preserve">, and </w:t>
+        <w:t xml:space="preserve">load tomorrow at 18:00 is net load today at 18:00, and weather and calendar refine it. Ablation answers a different question: removing a family and refitting costs +698.1 MW for weather but only +66.0 MW for the target lags, because refitting leaves near-substitutes standing (demand correlates at about 0.96 with net load). Permutation measures what this fitted model leans on; ablation measures what the model could not do without, and </w:t>
       </w:r>
       <w:proofErr w:type="gramStart"/>
       <w:r>
@@ -5729,7 +5461,7 @@
       </w:r>
       <w:proofErr w:type="gramEnd"/>
       <w:r>
-        <w:t xml:space="preserve"> the U, with a flat comfort bottom between about 11.9 °C and 19.6 °C.</w:t>
+        <w:t xml:space="preserve"> the U, with net load rising in both directions from about 16 °C.</w:t>
       </w:r>
     </w:p>
     <w:p>
@@ -5846,7 +5578,7 @@
         <w:t>Systematic: the afternoon ramp.</w:t>
       </w:r>
       <w:r>
-        <w:t xml:space="preserve"> Afternoon MAE exceeds overnight MAE by 481, 472 and 458 MW per hour at 14:00–16:00; a solar-ramp feature family that recovered a third of it would be worth about 40–51 MW, the same order as the whole tuning search. </w:t>
+        <w:t xml:space="preserve"> Afternoon MAE exceeds overnight MAE by 458–481 MW per hour, depending on how the two windows are drawn; a solar-ramp feature family that recovered a third of it would be worth about 40–51 MW, the same order as the whole tuning search. </w:t>
       </w:r>
       <w:r>
         <w:rPr>
@@ -5995,10 +5727,7 @@
         <w:jc w:val="both"/>
       </w:pPr>
       <w:r>
-        <w:t>A classification arm flags hours with more renewable output than the grid can use: renewable share above its zone's 85th percentile and net load below its zone's 15th percentile, a base rate of 15.85%. The classifier reaches PR-AUC 0.772, a 4.9× lift over the base rate (ROC-AUC 0.936); accuracy of 0.905 is the trap, since a model that never predicts curtailment scores 0.841. F1 is 0.674 at a threshold of 0.258 found on the holdout, and therefore optimistic. No feature restates the same-hour label; only lagg</w:t>
-      </w:r>
-      <w:r>
-        <w:t>ed copies of its inputs reach the model.</w:t>
+        <w:t xml:space="preserve">A classification arm flags hours at risk of curtailment, defined by a proxy: renewable share above its zone's 85th percentile and net load below its zone's 15th percentile, a base rate of 15.85%. The classifier reaches PR-AUC 0.772, a 4.9× lift over the base rate (ROC-AUC 0.936); accuracy of 0.905 is the trap, since a model that never predicts curtailment scores 0.841. F1 is 0.674 at a threshold of 0.258 found on the holdout, and therefore optimistic. No feature restates the same-hour label; only lagged copies of its inputs reach the model.</w:t>
       </w:r>
     </w:p>
     <w:p>
@@ -6028,22 +5757,10 @@
         <w:t xml:space="preserve">Two intervals are routinely </w:t>
       </w:r>
       <w:r>
-        <w:t>confusing</w:t>
-      </w:r>
-      <w:r>
-        <w:t xml:space="preserve">. The 90% </w:t>
-      </w:r>
-      <w:r>
-        <w:t>confidence</w:t>
-      </w:r>
-      <w:r>
-        <w:t xml:space="preserve"> interval for the mean holdout error of the median forecast is [−375.1, −191.8] MW on 1,974 zone-day blocks; the 90% </w:t>
-      </w:r>
-      <w:r>
-        <w:t>prediction</w:t>
-      </w:r>
-      <w:r>
-        <w:t xml:space="preserve"> interval for the next hour's error is [−5,893.5, +5,000.2] MW, 59 times wider. The first is epistemic and shrinks with data; the second is aleatoric, would not shrink with ten more years of history, and is what reserve is held against. Sizing reserve from the confidence interval would say no reserve is needed at all, because its upper edge is negative.</w:t>
+        <w:t xml:space="preserve">confused</w:t>
+      </w:r>
+      <w:r>
+        <w:t>. The 90% confidence interval for the mean holdout error of the median forecast is [−375.1, −191.8] MW on 1,974 zone-day blocks; the 90% prediction interval for the next hour's error is [−5,893.5, +5,000.2] MW, 59 times wider. The first is epistemic and shrinks with data; the second is aleatoric, would not shrink with ten more years of history, and is what reserve is held against. Sizing reserve from the confidence interval would say no reserve is needed at all, because its upper edge is negative.</w:t>
       </w:r>
     </w:p>
     <w:p>
@@ -6061,25 +5778,7 @@
         <w:jc w:val="both"/>
       </w:pPr>
       <w:r>
-        <w:t xml:space="preserve">The raw quantile model's quantiles </w:t>
-      </w:r>
-      <w:r>
-        <w:t>crossed</w:t>
-      </w:r>
-      <w:r>
-        <w:t xml:space="preserve"> on 10.034% of rows, which monotone rearrangement removed; its nominal 90% band </w:t>
-      </w:r>
-      <w:r>
-        <w:t>under-covered</w:t>
-      </w:r>
-      <w:r>
-        <w:t xml:space="preserve"> at 80.4%; and its </w:t>
-      </w:r>
-      <w:r>
-        <w:t>median was biased</w:t>
-      </w:r>
-      <w:r>
-        <w:t xml:space="preserve">: 54.1% of outcomes fell below it. Figure 14 scores nine constructions. Every calibrated arm </w:t>
+        <w:t xml:space="preserve">The raw quantile model's quantiles crossed on 10.034% of rows, which monotone rearrangement removed; its nominal 90% band under-covered at 80.4%; and its median was biased: 54.1% of outcomes fell below it. Figure 14 scores nine constructions. Every calibrated arm </w:t>
       </w:r>
       <w:proofErr w:type="gramStart"/>
       <w:r>
@@ -6087,25 +5786,7 @@
       </w:r>
       <w:proofErr w:type="gramEnd"/>
       <w:r>
-        <w:t xml:space="preserve"> inside the ±5-point tolerance at 88.4–88.9% coverage, so the choice is made on width and Winkler score: split conformal is widest and worst (10,594.5 MW, Winkler 15,750.6), and the shipped Mondrian CQR additive scores 8,709.5 MW / 11,545.4. Methods scored on the same hours move together, so every comparison is paired. The G3 scorecard at h=24: coverage </w:t>
-      </w:r>
-      <w:r>
-        <w:t>met</w:t>
-      </w:r>
-      <w:r>
-        <w:t xml:space="preserve"> (88.7%), crossings </w:t>
-      </w:r>
-      <w:r>
-        <w:t>met</w:t>
-      </w:r>
-      <w:r>
-        <w:t xml:space="preserve"> (10.0% → 0), median </w:t>
-      </w:r>
-      <w:r>
-        <w:t>missed</w:t>
-      </w:r>
-      <w:r>
-        <w:t xml:space="preserve"> (0.538 against 0.500 ± 0.010), because the calibration block is narrower than the holdout in every zone but one, which is drift.</w:t>
+        <w:t xml:space="preserve"> inside the ±5-point tolerance at 88.4–88.9% coverage, so the choice is made on width and Winkler score: split conformal is widest and worst (10,594.5 MW, Winkler 15,750.6), and the shipped Mondrian CQR additive scores 8,709.5 MW / 11,545.4. Methods scored on the same hours move together, so every comparison is paired. The G3 scorecard at h=24: coverage met (88.7%), crossings met (10.0% → 0), median missed (0.538 against 0.500 ± 0.010), because California's bias changed sign between the calibration block and the holdout, which is drift.</w:t>
       </w:r>
     </w:p>
     <w:p>
@@ -6181,14 +5862,7 @@
           <w:sz w:val="18"/>
           <w:szCs w:val="18"/>
         </w:rPr>
-        <w:t>(a) Coverage against mean width for every interval construction, with the nominal 90% dashed and the ±5-point tolerance shaded: the raw band under-covers, every calibrated band reaches the tolerance. (b) 90% coverage per zone, pooled against Mondrian; (c) the fraction of outcomes below the median per zone before and after the shifts, against the 0.500 ± 0.010 band. What to observe: conditioning on zone collapses the coverage spread from 19.6 to 5.0 points, but California's median moves away from 0.5. Source</w:t>
-      </w:r>
-      <w:r>
-        <w:rPr>
-          <w:sz w:val="18"/>
-          <w:szCs w:val="18"/>
-        </w:rPr>
-        <w:t>: notebook 08 §8.6; notebook 06 §6.2c (08_coverage_vs_width.png; 06_mondrian_by_zone.png).</w:t>
+        <w:t>(a) Coverage against mean width for every interval construction, with the nominal 90% dashed and the ±5-point tolerance shaded: the raw band under-covers, every calibrated band reaches the tolerance. (b) 90% coverage per zone, pooled against Mondrian; (c) the fraction of outcomes below the median per zone before and after the shifts, against the 0.500 ± 0.010 band. What to observe: conditioning on zone collapses the coverage spread from 19.6 to 5.0 points, but California's median moves away from 0.5. Source: notebook 08 §8.6; notebook 06 §6.2c (08_coverage_vs_width.png; 06_mondrian_by_zone.png).</w:t>
       </w:r>
     </w:p>
     <w:p>
@@ -6206,25 +5880,7 @@
       </w:r>
       <w:proofErr w:type="gramEnd"/>
       <w:r>
-        <w:t xml:space="preserve"> from +130.6 MW for Bonneville to +1,610.4 MW for Texas against the single pooled +619.1, and Winkler improved from 12,121 to 11,545 because the width went where the misses were. The median is the most informative failure: Mondrian fixed the zones whose bias was </w:t>
-      </w:r>
-      <w:r>
-        <w:t>cross-sectional</w:t>
-      </w:r>
-      <w:r>
-        <w:t xml:space="preserve"> (Bonneville exact at 0.502) and made California </w:t>
-      </w:r>
-      <w:r>
-        <w:t>worse</w:t>
-      </w:r>
-      <w:r>
-        <w:t xml:space="preserve">, 0.604 → 0.609, because California's bias is </w:t>
-      </w:r>
-      <w:r>
-        <w:t>temporal</w:t>
-      </w:r>
-      <w:r>
-        <w:t>: the shift fitted on the calibration block said its median was too low, while the holdout says it is too high. That sign reversal is the solar-fleet growth of Figure 3 showing up in the interval. The named fix, a rolling calibration window per zone [5], was not run.</w:t>
+        <w:t xml:space="preserve"> from +130.6 MW for Bonneville to +1,610.4 MW for Texas against the single pooled +619.1, and Winkler improved from 12,121 to 11,545 because the width went where the misses were. The median is the most informative failure: Mondrian fixed the zones whose bias was cross-sectional (Bonneville exact at 0.502) and made California worse, 0.604 → 0.609, because California's bias is temporal: the shift fitted on the calibration block said its median was too low, while the holdout says it is too high. That sign reversal is the solar-fleet growth of Figure 3 showing up in the interval. The named fix, a rolling calibration window per zone [5], was not run.</w:t>
       </w:r>
     </w:p>
     <w:p>
@@ -6242,13 +5898,7 @@
         <w:jc w:val="both"/>
       </w:pPr>
       <w:r>
-        <w:t xml:space="preserve">A band fitted, calibrated and scored at every horizon on that horizon's own champion reaches Mondrian coverage 85.9% at h=1, 88.8% at h=24, 89.4% at h=48 and 89.7% at h=72, so the conformal correction transfers across lead time. </w:t>
-      </w:r>
-      <w:r>
-        <w:t>h=1 is not helped</w:t>
-      </w:r>
-      <w:r>
-        <w:t xml:space="preserve"> (California 80.8%): the band is narrow there, so the California drift is a larger relative miss, and exchangeability between calibration and prediction blocks is the assumption a year of solar build-out breaks first. By regime the shipped band covers 90.8% of winter-shaped days, 90.0% of conventional days, 85.6% of duck days and 84.7% of duck-day evening hours (16:00–21:00): the regime the project exists for is the one the band protects least, which Section 7.6 acts on.</w:t>
+        <w:t>A band fitted, calibrated and scored at every horizon on that horizon's own champion reaches Mondrian coverage 85.9% at h=1, 88.8% at h=24, 89.4% at h=48 and 89.7% at h=72, so the conformal correction transfers across lead time. h=1 is not helped (California 80.8%): the band is narrow there, so the California drift is a larger relative miss, and exchangeability between calibration and prediction blocks is the assumption a year of solar build-out breaks first. By regime the shipped band covers 90.8% of winter-shaped days, 90.0% of conventional days, 85.6% of duck days and 84.7% of duck-day evening hours (16:00–21:00): the regime the project exists for is the one the band protects least, which Section 7.6 acts on.</w:t>
       </w:r>
     </w:p>
     <w:p>
@@ -6369,29 +6019,14 @@
         <w:jc w:val="both"/>
       </w:pPr>
       <w:r>
-        <w:t xml:space="preserve">The calibrated conditional band can be turned into a reserve rule and compared, at equal average risk, with the flat per-zone 95th-percentile rule an operator would use by default (Figure 15). Across the six zones the conditional band asks for 880 MW (3.7%) </w:t>
-      </w:r>
-      <w:r>
-        <w:rPr>
-          <w:i/>
-        </w:rPr>
-        <w:t>more</w:t>
-      </w:r>
-      <w:r>
-        <w:t xml:space="preserve">. What it buys is capacity in the right hours: across the evening ramp (16:00–20:00 local) the flat rule is short 8.3% of the time on conventional days and 5.8% on duck days against its nominal 5%, the conditional band 6.9% and 4.1%, at the price of more misses overnight on duck days. Conditioning does </w:t>
+        <w:t xml:space="preserve">The calibrated conditional band can be turned into a reserve rule and compared, at equal average risk, with the flat per-zone 95th-percentile rule an operator would use by default (Figure 15). Across the six zones the conditional band asks for 880 MW (3.7%) more. Both rules are set on the same holdout hours they are scored on, so this compares where reserve is placed at equal risk, not how either rule would do in a new year. What it buys is capacity in the right hours: across the evening ramp (16:00–20:00 local) the flat rule is short 8.3% of the time on conventional days and 5.8% on duck days against its nominal 5%, the conditional band 6.9% and 4.1%, at the price of more misses overnight on duck days. Conditioning does</w:t>
+      </w:r>
+      <w:r>
+        <w:t xml:space="preserve"> </w:t>
       </w:r>
       <w:r>
         <w:lastRenderedPageBreak/>
-        <w:t xml:space="preserve">not make reserve cheaper; it makes it better placed, and the regime label that barely helped the point forecast is what makes the placement possible. </w:t>
-      </w:r>
-      <w:r>
-        <w:rPr>
-          <w:b/>
-        </w:rPr>
-        <w:t>No monetary value is claimed</w:t>
-      </w:r>
-      <w:r>
-        <w:t>: across reserve-price scenarios and scoring conventions the annual value spans −31.6 to +40.6 million dollars, its sign depending on the convention.</w:t>
+        <w:t>not make reserve cheaper; it makes it better placed, and the regime label that barely helped the point forecast is what makes the placement possible. No monetary value is claimed: across reserve-price scenarios and scoring conventions the annual value spans −31.6 to +40.6 million dollars, its sign depending on the convention.</w:t>
       </w:r>
     </w:p>
     <w:p>
@@ -6476,13 +6111,13 @@
         <w:jc w:val="both"/>
       </w:pPr>
       <w:r>
-        <w:t>The question is natural and three designs asked it; the honest answer is that the data cannot settle it. A directed acyclic graph with demand growth, zone characteristics, weather and solar share gives 56 back-door paths from solar share to the evening ramp, 48 of them opened by conditioning on same-hour demand, a collider; the admissible observed set is {demand, humidity, temperature, wind speed}. The naive pooled slope is +582.1 MW of evening ramp per percentage point of solar share. Difference-in-differe</w:t>
-      </w:r>
-      <w:r>
-        <w:t xml:space="preserve">nces (Figure 16a), treating California, Texas and MISO against Bonneville, New York and the Plains at a 2022-01-01 cut-off, passes its pre-trend screen and estimates +2,083.8 MW with a 95% interval of [−856.9, +5,024.4] that contains zero, because the design learns from six groups. Propensity matching of high-solar to low-solar days (Figure 16b) gives +7,180.3 MW with a Rosenbaum Γ [17] of 18.40, but 98.5% of matched pairs are cross-zone, so the hidden confounder is which zone a day belongs to. The designs </w:t>
-      </w:r>
-      <w:r>
-        <w:t>agree on direction, disagree by a factor of three on size and none identifies it, so the report records a claim withheld rather than a claim made.</w:t>
+        <w:t>The question is natural and three designs asked it; th</w:t>
+      </w:r>
+      <w:r>
+        <w:t>e</w:t>
+      </w:r>
+      <w:r>
+        <w:t xml:space="preserve"> answer is that the data cannot settle it. A directed acyclic graph with demand growth, zone characteristics, weather and solar share gives 56 back-door paths from solar share to the evening ramp, 48 of them opened by conditioning on same-hour demand, a collider; the admissible observed set is {demand, humidity, temperature, wind speed}. The naive pooled slope is +582.1 MW of evening ramp per percentage point of solar share. Difference-in-differences (Figure 16a), treating California, Texas and MISO against Bonneville, New York and the Plains at a 2022-01-01 cut-off, passes its pre-trend screen and estimates +2,083.8 MW with a 95% interval of [−856.9, +5,024.4] that contains zero, because the design learns from six groups. Propensity matching of high-solar to low-solar days (Figure 16b) gives +7,180.3 MW with a Rosenbaum Γ [17] of 18.40, but 98.5% of matched pairs are cross-zone, so the obvious hidden confounder is which zone a day belongs to. The designs agree on direction, disagree by a factor of three on size and none identifies it, so the report records a claim withheld rather than a claim made.</w:t>
       </w:r>
     </w:p>
     <w:p>
@@ -6524,7 +6159,13 @@
         <w:t>Q2: a band that holds per region, with a named failure.</w:t>
       </w:r>
       <w:r>
-        <w:t xml:space="preserve"> Conditioning the conformal band on zone is what makes it honest for every grid; the remaining misses come from the test year drifting away from the calibration year in a way conditioning on zone cannot see. Lead time, not weather error, widens the band. </w:t>
+        <w:t xml:space="preserve"> Conditioning the conformal band on zone is what makes it </w:t>
+      </w:r>
+      <w:r>
+        <w:t>reliable</w:t>
+      </w:r>
+      <w:r>
+        <w:t xml:space="preserve"> for every grid; the remaining misses come from the test year drifting away from the calibration year in a way conditioning on zone cannot see. Lead time, not weather error, widens the band. </w:t>
       </w:r>
       <w:r>
         <w:rPr>
@@ -6561,7 +6202,7 @@
         <w:t>inside</w:t>
       </w:r>
       <w:r>
-        <w:t xml:space="preserve"> the forecaster's own cross-validation; the failure analysis reads the 16:00 error peak as the duck's ramp arriving early; and the uncertainty arm uses the regime as the conditioning variable of its reserve rule. The supervised arm produces the forecast, the unsupervised arm says what kind of day it is forecasting, and the interval connects both to a decision.</w:t>
+        <w:t xml:space="preserve"> the forecaster's own cross-validation; the failure analysis finds the error peaking at 16:00, where falling solar and peak heat coincide; and the uncertainty arm uses the regime as the conditioning variable of its reserve rule. The supervised arm produces the forecast, the unsupervised arm says what kind of day it is forecasting, and the interval connects both to a decision.</w:t>
       </w:r>
     </w:p>
     <w:p>
@@ -6576,10 +6217,7 @@
         <w:t>What surprised, and what went wrong.</w:t>
       </w:r>
       <w:r>
-        <w:t xml:space="preserve"> Mutual information would have deleted useful features; the lag family the model leans on most is nearly replaceable on refit while weather is not; and three defects were found by audit rather than avoided (the fuel columns, the rolling windows, the local-versus-UTC join of the regime labels), each measured before it was fixed. The method is as much the result as the numbers: goals and predictions registered before modelling, a holdout sealed before tuning, every comparison paired and blocked, and every num</w:t>
-      </w:r>
-      <w:r>
-        <w:t>ber traced to a ledger.</w:t>
+        <w:t xml:space="preserve"> Mutual information would have deleted useful features; the lag family the model leans on most is nearly replaceable on refit while weather is not; and three defects were found by audit (the fuel columns, the rolling windows, the local-versus-UTC join of the regime labels), each measured before it was fixed. The method is as much the result as the numbers: goals and predictions registered before modelling, a holdout sealed before tuning, every comparison paired and blocked, and every number traced to a ledger.</w:t>
       </w:r>
     </w:p>
     <w:p>
@@ -6594,7 +6232,7 @@
         <w:t>Ethics and deployment.</w:t>
       </w:r>
       <w:r>
-        <w:t xml:space="preserve"> An under-forecast of the evening ramp is paid for by consumers through scarcity prices or load shedding, so the recommended operational object is the conditional band, not the point forecast, and abstaining on imputed inputs is an ethical choice as well as a technical one. Bonneville and New York gain little or nothing, and replacing their operators' own forecasts would be a regression, which per-region reporting makes visible.</w:t>
+        <w:t xml:space="preserve"> An under-forecast of the evening ramp is paid for by consumers through scarcity prices or load shedding, so the recommended operational object is the conditional band, not the point forecast, and abstaining on imputed inputs is an ethical choice as well as a technical one. New York gains nothing over the strengthened composite, so replacing its operator's own forecast there would not be an improvement, which per-region reporting makes visible.</w:t>
       </w:r>
     </w:p>
     <w:p>
@@ -7043,7 +6681,7 @@
                 <w:sz w:val="17"/>
                 <w:szCs w:val="17"/>
               </w:rPr>
-              <w:t>Net load ≈ demand there; the ISO's forecast cannot be beaten (paired gap includes zero)</w:t>
+              <w:t xml:space="preserve">Net load ≈ demand there; the strengthened composite built on the ISO's forecast is not beaten (paired gap includes zero)</w:t>
             </w:r>
           </w:p>
         </w:tc>
@@ -7181,7 +6819,7 @@
                 <w:sz w:val="17"/>
                 <w:szCs w:val="17"/>
               </w:rPr>
-              <w:t>The 0.674 operating point is optimistic; the fan chart's trough escapes are a visual reading</w:t>
+              <w:t xml:space="preserve">The 0.674 operating point is optimistic; the trough escapes in notebook 06's fan chart are a visual reading</w:t>
             </w:r>
           </w:p>
         </w:tc>
@@ -7296,7 +6934,7 @@
           <w:sz w:val="18"/>
           <w:szCs w:val="18"/>
         </w:rPr>
-        <w:t>Limitations, their consequences and the named remedy. Source: docs/03_decision_log.md; notebooks 01, 04, 05, 06, 08.</w:t>
+        <w:t xml:space="preserve">Limitations, their consequences and the named remedy. Source: docs/decision_log.md; notebooks 01, 04, 05, 06, 08.</w:t>
       </w:r>
     </w:p>
     <w:p>
@@ -7320,11 +6958,11 @@
         <w:t>Future work</w:t>
       </w:r>
       <w:r>
-        <w:t xml:space="preserve"> follows the failure analysis in priority order: several weather points per region with a load-weighted mean, the one change that addresses the hardest region, the worst-covered zone and the published finding on </w:t>
+        <w:t xml:space="preserve"> follows the failure analysis in priority order: several weather points per region with a load-weighted mean, the one change that addresses the hardest region, the worst-covered zone and the published finding on station selection at once; a solar-ramp feature family from forecast irradiance, aimed at the 16:00 peak; a rolling </w:t>
       </w:r>
       <w:r>
         <w:lastRenderedPageBreak/>
-        <w:t>station selection at once; a solar-ramp feature family from forecast irradiance, aimed at the 16:00 peak; a rolling calibration window per zone for the median and h=1 coverage failures; and a second test year with a January and, ideally, an extreme episode. None of these needs a different model: what would help is better inputs and a calibration that moves with the grid.</w:t>
+        <w:t>calibration window per zone for the median and h=1 coverage failures; and a second test year with a January and, ideally, an extreme episode. None of these needs a different model: what would help is better inputs and a calibration that moves with the grid.</w:t>
       </w:r>
     </w:p>
     <w:p>

</xml_diff>

<commit_message>
Report: author's Word edits; PDF re-exported from the docx
</commit_message>
<xml_diff>
--- a/reports/Milestone_II_Final_Report.docx
+++ b/reports/Milestone_II_Final_Report.docx
@@ -579,7 +579,10 @@
         <w:jc w:val="both"/>
       </w:pPr>
       <w:r>
-        <w:t>Three findings went against the project and are reported as such: the regime labels improve the point forecast by only 17.4 MW; 77% of duck days are California's; and the calibrated median sits at 0.538 rather than 0.500 because the holdout year drifted from the calibration year. The largest error, a 57,477 MW miss in MISO, is a data failure that can be flagged from the inputs alone. A reserve rule built on the regime-conditional band moves shortfall on duck-day evening ramps from 5.8% to 4.1% of hours for 3.7% more capacity; no monetary value is claimed. Figure 1 summarises the project on one page.</w:t>
+        <w:t xml:space="preserve">Three findings went against the project and are reported as such: the regime labels improve the point forecast by only 17.4 MW; 77% of duck days are California's; and the calibrated median sits at 0.538 rather than 0.500 because the holdout year drifted from the calibration year. The largest error, a 57,477 MW miss in MISO, is a data failure that can be flagged from the inputs alone. A reserve rule built on the regime-conditional band moves shortfall on duck-day evening ramps from 5.8% to 4.1% of hours for </w:t>
+      </w:r>
+      <w:r>
+        <w:t>3.7% more capacity; no monetary value is claimed. Figure 1 summarises the project on one page.</w:t>
       </w:r>
     </w:p>
     <w:p>
@@ -651,7 +654,14 @@
           <w:sz w:val="18"/>
           <w:szCs w:val="18"/>
         </w:rPr>
-        <w:t>The project on one page. Panels 1–3 state the problem: wind and solar grew from 16.6% to 26.2% of the six grids' generation, California's lowest midday net load fell from 13.7 GW (2019) to 9.9 GW (2024), and the EIA forecast covers only demand, so its wind-and-solar leg carries 2,770 MW of error against 1,048 MW for demand. Panels 4–6 state the answer: 2,140 MW day-ahead error against 4,260, 3,059 and 2,486 MW for the three benchmarks; the model's inputs; and a 90% band covering 88.7% of real hours. Source: reports/overview/project_overview.png.</w:t>
+        <w:t>The project on one page. Panels 1–3 state the problem: wind and solar grew from 16.6% to 26.2% of the six grids' generation, California's lowest midday net load fell from 13.7 GW (2019) to 9.9 GW (2024), and the EIA forecast covers only demand, so its wind-and-solar leg carries 2,770 MW of error against 1,048 MW for demand. Panels 4–6 state the answer: 2,140 MW day-ahead error against 4,260, 3,059 and 2,486 MW for the three benchmarks; the model's inputs; and a 90% band covering 88.7% of real hours. Source:</w:t>
+      </w:r>
+      <w:r>
+        <w:rPr>
+          <w:sz w:val="18"/>
+          <w:szCs w:val="18"/>
+        </w:rPr>
+        <w:t xml:space="preserve"> reports/overview/project_overview.png.</w:t>
       </w:r>
     </w:p>
     <w:p>
@@ -731,7 +741,14 @@
           <w:sz w:val="18"/>
           <w:szCs w:val="18"/>
         </w:rPr>
-        <w:t>The duck curve is a measurement, not a metaphor. (a) California's median 2024 day in local time: demand (black), net load (orange) and the wedge wind and solar served. (b) The same profile for each year 2019–2024: the belly deepens and moves later. (c) Each day's steepest three-hour evening ramp, median and 95th-percentile day per year. (d) Every region's 2024 median profile divided by its own daily mean: only California has a deep midday belly. Source: notebook 00 §0.6 (00_duck_curve.png).</w:t>
+        <w:t>The duck curve is a measurement</w:t>
+      </w:r>
+      <w:r>
+        <w:rPr>
+          <w:sz w:val="18"/>
+          <w:szCs w:val="18"/>
+        </w:rPr>
+        <w:t>. (a) California's median 2024 day in local time: demand (black), net load (orange) and the wedge wind and solar served. (b) The same profile for each year 2019–2024: the belly deepens and moves later. (c) Each day's steepest three-hour evening ramp, median and 95th-percentile day per year. (d) Every region's 2024 median profile divided by its own daily mean: only California has a deep midday belly. Source: notebook 00 §0.6 (00_duck_curve.png).</w:t>
       </w:r>
     </w:p>
     <w:p>
@@ -744,18 +761,15 @@
         <w:t xml:space="preserve">Every hour a grid operator must match generation to consumption exactly. Without wind or solar the day-ahead problem is essentially solved: demand follows the clock, the calendar and the temperature. Wind and solar are generation the operator does not schedule, so the plants it </w:t>
       </w:r>
       <w:r>
-        <w:rPr>
-          <w:i/>
-        </w:rPr>
         <w:t>does</w:t>
       </w:r>
       <w:r>
-        <w:t xml:space="preserve"> control must meet only net load, and that remainder sets how many plants to commit the evening before and how much reserve to hold. In California (Figure 2), demand on the median 2024 day moves by only 6,140 MW while net load swings 14,851 MW, from a belly of 9,947 MW at 14:00 to 24,798 MW at 21:00, and the steepest three-hour evening ramp on a median day rose 45% from 2019 to 2024. Commitment is decided on a forecast, which is why this project forecasts at 1, 24, 48 and 72 hours, and reserve is sized from the forecast </w:t>
-      </w:r>
-      <w:r>
-        <w:rPr>
-          <w:i/>
-        </w:rPr>
+        <w:t xml:space="preserve"> control must meet only net load, and that remainder sets how many plants to commit the evening before and how much reserve to hold. In California (Figure 2), demand on the median 2024 day moves by only 6,140 MW while net load swings 14,851 MW, from a belly of 9,947 MW at 14:00 to 24,798 MW at 21:00, and the steepest three-hour evening ramp on a median day rose 45% from 2019 to 2024. Commitment is decided on a forecast, which is why this project forecasts at 1, 24, 48 and 72 hours, and reserve is sized from</w:t>
+      </w:r>
+      <w:r>
+        <w:t xml:space="preserve"> the forecast </w:t>
+      </w:r>
+      <w:r>
         <w:t>error</w:t>
       </w:r>
       <w:r>
@@ -1239,34 +1253,36 @@
         <w:t>What the forecast has to beat.</w:t>
       </w:r>
       <w:r>
-        <w:t xml:space="preserve"> Every result is scored on the same held-out hours against three benchmarks, each harder than the last: </w:t>
-      </w:r>
-      <w:r>
-        <w:rPr>
-          <w:b/>
-        </w:rPr>
+        <w:t xml:space="preserve"> </w:t>
+      </w:r>
+      <w:r>
+        <w:t xml:space="preserve">Every result is scored on the same held-out hours against three benchmarks, each harder than the last: </w:t>
+      </w:r>
+      <w:r>
         <w:t>seasonal naive</w:t>
       </w:r>
       <w:r>
         <w:t xml:space="preserve">, the same hour one week earlier (4,259.8 MW off); the </w:t>
       </w:r>
       <w:r>
-        <w:rPr>
-          <w:b/>
-        </w:rPr>
         <w:t>EIA composite</w:t>
       </w:r>
       <w:r>
         <w:t xml:space="preserve">, the EIA's day-ahead demand forecast minus the previous day's wind and solar (3,059.2 MW); and a </w:t>
       </w:r>
       <w:r>
-        <w:rPr>
-          <w:b/>
-        </w:rPr>
         <w:t>strengthened composite v2</w:t>
       </w:r>
       <w:r>
-        <w:t xml:space="preserve"> whose wind leg is replaced by a weather regression (2,485.9 MW). The EIA's own forecast is good on its own target (1,048.5 MW on demand); it is the renewables leg, 2,769.7 MW of error, that it lacks.</w:t>
+        <w:t xml:space="preserve"> whose wind leg is replaced by a weather regression (2,485.9 MW). The EIA's own forecast is good </w:t>
+      </w:r>
+      <w:proofErr w:type="gramStart"/>
+      <w:r>
+        <w:t>on</w:t>
+      </w:r>
+      <w:proofErr w:type="gramEnd"/>
+      <w:r>
+        <w:t xml:space="preserve"> its own target (1,048.5 MW on demand); it is the renewables leg, 2,769.7 MW of error, that it lacks.</w:t>
       </w:r>
     </w:p>
     <w:p>
@@ -1275,7 +1291,10 @@
         <w:jc w:val="both"/>
       </w:pPr>
       <w:r>
-        <w:t>GEFCom2014 set the reference for probabilistic load forecasting on the pinball loss [11]; this project forecasts net load for six balancing authorities and calibrates its quantiles per region with conformal prediction [3, 4]. Kaur et al. [12] found that forecasting net load directly beat forecasting load and solar separately; Denholm et al. [14] analyse the duck chart as California's problem, and Section 2 finds it in one grid of six; Ruggles et al. [15] impute EIA-930 gaps where this project abstains; Hong et al. [16] show weather-station choice moves accuracy, the basis for the first upgrade in Section 9.</w:t>
+        <w:t>GEFCom2014 set the reference for probabilistic load forecasting on the pinball loss [11]; this project forecasts net load for six balancing authorities and calibrates its quantiles per region with conformal prediction [3, 4]. Kaur et al. [12] found that forecasting net load directly beat forecasting load and solar separately; Denholm et al. [14] analyse the duck chart as California's problem, and Section 2 finds it in one grid of six; Ruggles et al. [15] impute EIA-930 gaps where this project abstains; Hong</w:t>
+      </w:r>
+      <w:r>
+        <w:t xml:space="preserve"> et al. [16] show weather-station choice moves accuracy, the basis for the first upgrade in Section 9.</w:t>
       </w:r>
     </w:p>
     <w:p>
@@ -1287,45 +1306,30 @@
         <w:t xml:space="preserve">Goals were fixed before any model ran and two were later made stricter (Table 1). Five predictions were also registered in notebook 01, before the supervised notebook existed: </w:t>
       </w:r>
       <w:r>
-        <w:rPr>
-          <w:b/>
-        </w:rPr>
         <w:t>P1</w:t>
       </w:r>
       <w:r>
         <w:t xml:space="preserve"> MAE rises with the horizon and the largest step is h=1 → h=24; </w:t>
       </w:r>
       <w:r>
-        <w:rPr>
-          <w:b/>
-        </w:rPr>
         <w:t>P2</w:t>
       </w:r>
       <w:r>
         <w:t xml:space="preserve"> the weekly lag overtakes the daily lag in importance as the horizon lengthens; </w:t>
       </w:r>
       <w:r>
-        <w:rPr>
-          <w:b/>
-        </w:rPr>
         <w:t>P3</w:t>
       </w:r>
       <w:r>
         <w:t xml:space="preserve"> MAE is worst in the evening ramp hours (17:00–21:00 local); </w:t>
       </w:r>
       <w:r>
-        <w:rPr>
-          <w:b/>
-        </w:rPr>
         <w:t>P4</w:t>
       </w:r>
       <w:r>
         <w:t xml:space="preserve"> scaled error is highest in the Plains and lowest in New York; </w:t>
       </w:r>
       <w:r>
-        <w:rPr>
-          <w:b/>
-        </w:rPr>
         <w:t>P5</w:t>
       </w:r>
       <w:r>
@@ -1359,28 +1363,27 @@
         <w:t xml:space="preserve">Three public sources were combined. </w:t>
       </w:r>
       <w:r>
-        <w:rPr>
-          <w:b/>
-        </w:rPr>
         <w:t>EIA-930</w:t>
       </w:r>
       <w:r>
         <w:t xml:space="preserve"> [1] reports, per balancing authority and hour, metered demand, the operator-submitted day-ahead demand forecast and generation by fuel: lagged demand is an input, the forecast is the benchmark, and demand minus wind minus solar defines the target. </w:t>
       </w:r>
       <w:r>
-        <w:rPr>
-          <w:b/>
-        </w:rPr>
         <w:t>ERA5 reanalysis</w:t>
       </w:r>
       <w:r>
         <w:t xml:space="preserve"> from Open-Meteo [2] supplies fifteen hourly weather variables at one population-weighted point per region, and </w:t>
       </w:r>
       <w:r>
-        <w:rPr>
-          <w:b/>
-        </w:rPr>
-        <w:t>Open-Meteo's archived forecasts</w:t>
+        <w:t>Open-</w:t>
+      </w:r>
+      <w:proofErr w:type="gramStart"/>
+      <w:r>
+        <w:t>Meteo's archived</w:t>
+      </w:r>
+      <w:proofErr w:type="gramEnd"/>
+      <w:r>
+        <w:t xml:space="preserve"> forecasts</w:t>
       </w:r>
       <w:r>
         <w:t xml:space="preserve"> supply six of them as they were forecast one to three days ahead over the holdout year (Section 7.5). The raw panel is 315,648 rows (6 zones × 52,608 hours).</w:t>
@@ -1393,7 +1396,10 @@
       </w:pPr>
       <w:r>
         <w:lastRenderedPageBreak/>
-        <w:t>Six balancing authorities were chosen for contrast (Table 2): they differ by a factor of ten in size, nine in renewable share, and in the shape of the day itself; only California has an afternoon solar belly, while the others trough overnight. Pre-registered cleaning nulled twelve impossible values and interpolated short gaps, and dropped four 24-hour demand outages (one in MISO from 2024-07-01 06:00) plus 67 further rows, 163 rows in all (0.052%), leaving 315,485. The split is chronological: the holdout begins on 2024-02-07, so it holds no January, and it is 2.16 °C warmer than the development block; Section 5.2 addresses the missing winter with rolling-origin refits.</w:t>
+        <w:t>Six balancing authorities were chosen for contrast (Table 2): they differ by a factor of ten in size, nine in renewable share, and in the shape of the day itself; only California has an afternoon solar belly, while the others trough overnight. Pre-registered cleaning nulled twelve impossible values and interpolated short gaps, and dropped four 24-hour demand outages (one in MISO from 2024-07-01 06:00) plus 67 further rows, 163 rows in all (0.052%), leaving 315,485. The split is chronological: the holdout be</w:t>
+      </w:r>
+      <w:r>
+        <w:t>gins on 2024-02-07, so it holds no January, and it is 2.16 °C warmer than the development block; Section 5.2 addresses the missing winter with rolling-origin refits.</w:t>
       </w:r>
     </w:p>
     <w:tbl>
@@ -2654,7 +2660,13 @@
         <w:jc w:val="both"/>
       </w:pPr>
       <w:r>
-        <w:t>The supervised and unsupervised arms share everything up to and including the feature pipeline (Figure 5) and diverge only at notebooks 04 and 05; they are reunited in notebook 07, where a surrogate tree explains the clusters with the forecaster's inputs, and in the uncertainty arm, which conditions its reserve rule on the regimes. The comparison is fair because the protocol is shared: the same 315,485-row panel, the same five expanding chronological folds with a 191-hour gap at h=24 (168 hours for the longest rolling window plus the horizon minus one), and the same sealed holdout of 47,299 rows. A random split of hourly rows would place a training hour next to a validation hour that is 0.976 correlated with it and report an error no operator could reproduce. A pooled model with zone identity as a feature was chosen over six per-zone models because the lags carry each zone's level and the small zones have too little variation to tune separately; deep sequence models were rejected for a tabular problem of 57 features where tree ensembles are the established frontier and interpretability is required.</w:t>
+        <w:t>The supervised and unsupervised arms share everything up to and including the feature pipeline (Figure 5) and diverge only at notebooks 04 and 05; they are reunited in notebook 07, where a surrogate tree explains the clusters with the forecaster's inputs, and in the uncertainty arm, which conditions its reserve rule on the regimes. The comparison is fair because the protocol is shared: the same 315,485-row panel, the same five expanding chronological folds with a 191-hour gap at h=24 (168 hours for the long</w:t>
+      </w:r>
+      <w:r>
+        <w:t>est rolling window plus the horizon minus one), and the same sealed holdout of 47,299 rows. A random split of hourly rows would place a training hour next to a validation hour that is 0.976 correlated with it and report an error no operator could reproduce. A pooled model with zone identity as a feature was chosen over six per-zone models because the lags carry each zone's level and the small zones have too little variation to tune separately; deep sequence models were rejected for a tabular problem of 57 f</w:t>
+      </w:r>
+      <w:r>
+        <w:t>eatures where tree ensembles are the established frontier and interpretability is required.</w:t>
       </w:r>
     </w:p>
     <w:p>
@@ -2836,29 +2848,25 @@
       <w:r>
         <w:t xml:space="preserve">, </w:t>
       </w:r>
-      <w:proofErr w:type="spellStart"/>
       <w:r>
         <w:rPr>
           <w:rFonts w:ascii="Consolas" w:eastAsia="Consolas" w:hAnsi="Consolas" w:cs="Consolas"/>
           <w:sz w:val="19"/>
           <w:szCs w:val="19"/>
         </w:rPr>
-        <w:t>net_generation</w:t>
-      </w:r>
-      <w:proofErr w:type="spellEnd"/>
+        <w:t>net generation</w:t>
+      </w:r>
       <w:r>
         <w:t xml:space="preserve">, </w:t>
       </w:r>
-      <w:proofErr w:type="spellStart"/>
       <w:r>
         <w:rPr>
           <w:rFonts w:ascii="Consolas" w:eastAsia="Consolas" w:hAnsi="Consolas" w:cs="Consolas"/>
           <w:sz w:val="19"/>
           <w:szCs w:val="19"/>
         </w:rPr>
-        <w:t>total_interchange</w:t>
-      </w:r>
-      <w:proofErr w:type="spellEnd"/>
+        <w:t>total interchange</w:t>
+      </w:r>
       <w:r>
         <w:t xml:space="preserve"> and all nine fuel columns are excluded; their lagged copies are admissible. </w:t>
       </w:r>
@@ -2866,11 +2874,9 @@
         <w:lastRenderedPageBreak/>
         <w:t xml:space="preserve">A unit test now fails if any unvetted column becomes a feature. Second, a trailing </w:t>
       </w:r>
-      <w:proofErr w:type="gramStart"/>
-      <w:r>
-        <w:t>mean</w:t>
-      </w:r>
-      <w:proofErr w:type="gramEnd"/>
+      <w:r>
+        <w:t>means</w:t>
+      </w:r>
       <w:r>
         <w:t xml:space="preserve"> computed as </w:t>
       </w:r>
@@ -2901,7 +2907,18 @@
         <w:t>()</w:t>
       </w:r>
       <w:r>
-        <w:t xml:space="preserve"> includes the current row, which is correct at h=1 but at longer horizons reaches into hours the operator has not lived through. Measured: admissible and leaked arms are identical at h=1 (538.8 MW each), but the leaked model scores 1,874.8 against the admissible 2,173.2 MW at h=24 (optimism 298.4 MW, 13.7%) and 1,890.1 against 2,615.1 MW at h=72 (725.1 MW, 27.7%). The leaked model degrades by only 15.3 MW from h=24 to h=72 against the admissible 442.0 MW; it erased the horizon signal, and a check at h=1 alone would have found nothing.</w:t>
+        <w:t xml:space="preserve"> includes the current row, which is correct at h=1 but at longer horizons </w:t>
+      </w:r>
+      <w:proofErr w:type="gramStart"/>
+      <w:r>
+        <w:t>reaches</w:t>
+      </w:r>
+      <w:proofErr w:type="gramEnd"/>
+      <w:r>
+        <w:t xml:space="preserve"> into hours the operator has not lived through. Measured: admissible and leaked arms are identical at h=1 (538.8 MW each), but the leaked model scores 1,874.8 against the admissible 2,173.2 MW at h=24 (optimism 298.4 MW, 13.7%) and 1,890.1 against 2,615.1 MW at h=72 (725.1 MW, 27.7%). The leaked model degrades by only 15.3 MW from h=24 to h=72 against the admissible 442.0 MW; it erased the horizon signal, and a check at h=1 alo</w:t>
+      </w:r>
+      <w:r>
+        <w:t>ne would have found nothing.</w:t>
       </w:r>
     </w:p>
     <w:p>
@@ -2969,7 +2986,14 @@
           <w:sz w:val="18"/>
           <w:szCs w:val="18"/>
         </w:rPr>
-        <w:t>Two leaks, measured before removal. (a) the sum of the nine same-hour fuel columns against net load per region, with the 45° identity line; Texas (r = 0.9997), the Plains and MISO lie on it, and New York (r = 0.9518) sits just below it. (b) cross-validated MAE by horizon with rolling windows ending at the forecast origin (admissible) against windows ending the hour before the target (leaked): the arms coincide at h=1 and the leaked model's error barely moves with the horizon because it is reading part of the answer. Source: notebook 02 §2.15; notebook 04 §4.2 (02_leakage_fuel_columns.png; 04_leak_cost.png).</w:t>
+        <w:t>Two leaks, measured before removal. (a) the sum of the nine same-hour fuel columns against net load per region, with the 45° identity line; Texas (r = 0.9997), the Plains and MISO lie on it, and New York (r = 0.9518) sits just below it. (b) cross-validated MAE by horizon with rolling windows ending at the forecast origin (admissible) against windows ending the hour before the target (leaked): the arms coincide at h=1 and the leaked model's error barely moves with the horizon because it is reading part of th</w:t>
+      </w:r>
+      <w:r>
+        <w:rPr>
+          <w:sz w:val="18"/>
+          <w:szCs w:val="18"/>
+        </w:rPr>
+        <w:t>e answer. Source: notebook 02 §2.15; notebook 04 §4.2 (02_leakage_fuel_columns.png; 04_leak_cost.png).</w:t>
       </w:r>
     </w:p>
     <w:p>
@@ -2990,54 +3014,36 @@
         <w:t xml:space="preserve">Six feature families are computed inside the pipeline: </w:t>
       </w:r>
       <w:r>
-        <w:rPr>
-          <w:b/>
-        </w:rPr>
         <w:t>target lags</w:t>
       </w:r>
       <w:r>
         <w:t xml:space="preserve"> at the horizon's lag set; </w:t>
       </w:r>
       <w:r>
-        <w:rPr>
-          <w:b/>
-        </w:rPr>
         <w:t>rolling statistics</w:t>
       </w:r>
       <w:r>
         <w:t xml:space="preserve"> (24- and 168-hour trailing mean and standard deviation ending at the origin); </w:t>
       </w:r>
       <w:r>
-        <w:rPr>
-          <w:b/>
-        </w:rPr>
         <w:t>calendar</w:t>
       </w:r>
       <w:r>
         <w:t xml:space="preserve"> (hour, weekday, month, weekend, a year-end holiday proxy, with sine and cosine encodings); </w:t>
       </w:r>
       <w:r>
-        <w:rPr>
-          <w:b/>
-        </w:rPr>
         <w:t>weather</w:t>
       </w:r>
       <w:r>
         <w:t xml:space="preserve"> (fifteen ERA5 columns plus heating and cooling degree terms and a per-zone clear-sky index); </w:t>
       </w:r>
       <w:r>
-        <w:rPr>
-          <w:b/>
-        </w:rPr>
         <w:t>exogenous lags</w:t>
       </w:r>
       <w:r>
         <w:t xml:space="preserve"> (lagged demand and fuel columns); and </w:t>
       </w:r>
       <w:r>
-        <w:rPr>
-          <w:b/>
-        </w:rPr>
         <w:t>zone</w:t>
       </w:r>
       <w:r>
@@ -3062,27 +3068,26 @@
         <w:t xml:space="preserve">): the forward-selection curve has no knee, and the 39 </w:t>
       </w:r>
       <w:r>
-        <w:rPr>
-          <w:i/>
-        </w:rPr>
         <w:t>lowest-ranked</w:t>
       </w:r>
       <w:r>
-        <w:t xml:space="preserve"> features are jointly worth 61.95 MW. Mutual information scores features </w:t>
-      </w:r>
-      <w:r>
-        <w:rPr>
-          <w:i/>
-        </w:rPr>
+        <w:t xml:space="preserve"> features are jointly worth 61.95 MW. Mutual information scores </w:t>
+      </w:r>
+      <w:proofErr w:type="gramStart"/>
+      <w:r>
+        <w:t>features</w:t>
+      </w:r>
+      <w:proofErr w:type="gramEnd"/>
+      <w:r>
+        <w:t xml:space="preserve"> </w:t>
+      </w:r>
+      <w:r>
         <w:t>marginally</w:t>
       </w:r>
       <w:r>
         <w:t xml:space="preserve">, while the model uses them </w:t>
       </w:r>
       <w:r>
-        <w:rPr>
-          <w:i/>
-        </w:rPr>
         <w:t>conditionally</w:t>
       </w:r>
       <w:r>
@@ -3116,9 +3121,6 @@
         <w:t xml:space="preserve">Four benchmarks bound the results: seasonal naive, persistence (1,211.9 MW, fair at h=1 only), the EIA composite v1 and composite v2. The supervised ladder climbs from ordinary least squares, to ridge, to a random forest, to histogram gradient boosting [18] (the champion), to a quantile gradient-boosting model that produces the seven quantiles Section 7 needs, each rung justified by a failure of the one below. Tuning searched the </w:t>
       </w:r>
       <w:r>
-        <w:rPr>
-          <w:i/>
-        </w:rPr>
         <w:t>whole pipeline</w:t>
       </w:r>
       <w:r>
@@ -3135,7 +3137,10 @@
         <w:t>MAE</w:t>
       </w:r>
       <w:r>
-        <w:t xml:space="preserve"> in megawatts, the unit reserve is procured in; RMSE was set aside because the error distribution is heavy-tailed, and MAPE because minimising it pulls forecasts low. Model differences are tested with Diebold–Mariano [7] and Wilcoxon signed-rank tests on 1,974 zone-day blocks with Benjamini–Hochberg correction [10], because hourly residuals are autocorrelated at 0.95. Intervals are scored by coverage, width and the Winkler score [6]; clusters by adjusted Rand index (ARI) [20] stability under 80% resampling; the classifier by PR-AUC against its base rate.</w:t>
+        <w:t xml:space="preserve"> in megawatts, the unit reserve is procured in; RMSE was set aside because the error distribution is heavy-tailed, and MAPE because minimising it pulls forecasts low. Model differences are tested with Diebold–Mariano [7] and Wilcoxon signed-rank tests on 1,974 zone-day blocks with Benjamini–Hochberg correction [10], because hourly residuals are autocorrelated at 0.95. Intervals are scored by coverage, width and the Winkler score [6]; clusters by adjusted Rand index (ARI) [20] stability under 80% resampling;</w:t>
+      </w:r>
+      <w:r>
+        <w:t xml:space="preserve"> the classifier by PR-AUC against its base rate.</w:t>
       </w:r>
     </w:p>
     <w:p>
@@ -3156,9 +3161,6 @@
         <w:t xml:space="preserve">The unsupervised question is about </w:t>
       </w:r>
       <w:r>
-        <w:rPr>
-          <w:i/>
-        </w:rPr>
         <w:t>shape</w:t>
       </w:r>
       <w:r>
@@ -3171,7 +3173,28 @@
         <w:jc w:val="both"/>
       </w:pPr>
       <w:r>
-        <w:t>Prediction intervals come from a quantile gradient-boosting model at seven levels (0.05 to 0.95) on the champion's feature set, repaired and calibrated in three measured steps: monotone rearrangement [19] to remove quantile crossing; a chronological split of the development block at 2023-01-30 into a fit block and a calibration block; and nine interval constructions compared on the holdout, from split conformal and conformalised quantile regression (CQR) [3] to Mondrian versions conditioned on zone [4]. The shipped arm is CQR additive, Mondrian by zone.</w:t>
+        <w:t>Prediction intervals come from a quantile gradient-boosting model at seven levels (0.05 to 0.95) on the champion's feature set, repaired and calibrated in three measured steps: monotone rearrangement [19] to remove quantile crossing; a chronological split of the development block at 2023-01-30 into a fit block and a calibration block; and nine interval constructions compared on the holdout, from split conformal and conformalised quantile regression (CQR) [3] to Mondrian versions conditioned on zone [4]. The</w:t>
+      </w:r>
+      <w:r>
+        <w:t xml:space="preserve"> shipped arm is CQR additive, Mondrian by zone.</w:t>
+      </w:r>
+    </w:p>
+    <w:p>
+      <w:pPr>
+        <w:pStyle w:val="Heading1"/>
+        <w:keepNext/>
+      </w:pPr>
+      <w:r>
+        <w:t>4. Unsupervised learning: what kind of day is it?</w:t>
+      </w:r>
+    </w:p>
+    <w:p>
+      <w:pPr>
+        <w:pStyle w:val="Heading2"/>
+        <w:keepNext/>
+      </w:pPr>
+      <w:r>
+        <w:t>4.1 Choosing the partition</w:t>
       </w:r>
     </w:p>
     <w:p>
@@ -3180,40 +3203,13 @@
         <w:jc w:val="both"/>
       </w:pPr>
       <w:r>
-        <w:rPr>
-          <w:b/>
-        </w:rPr>
-        <w:t>Reproducibility.</w:t>
-      </w:r>
-      <w:r>
-        <w:t xml:space="preserve"> Every number is written by a notebook to one results ledger (</w:t>
-      </w:r>
-      <w:r>
-        <w:rPr>
-          <w:rFonts w:ascii="Consolas" w:eastAsia="Consolas" w:hAnsi="Consolas" w:cs="Consolas"/>
-        </w:rPr>
-        <w:t>data/processed/results.json</w:t>
-      </w:r>
-      <w:r>
-        <w:t xml:space="preserve">), and figures are drawn from the same ledger; </w:t>
-      </w:r>
-      <w:r>
-        <w:rPr>
-          <w:rFonts w:ascii="Consolas" w:eastAsia="Consolas" w:hAnsi="Consolas" w:cs="Consolas"/>
-        </w:rPr>
-        <w:t>src/</w:t>
-      </w:r>
-      <w:r>
-        <w:t xml:space="preserve"> carries the pipeline under a test suite with a leakage test. Notebook 08 re-reads 927 numbers quoted in the previous report: 791 reproduce, 5 are wall-clock times, 131 are design constants, and 0 differ.</w:t>
-      </w:r>
-    </w:p>
-    <w:p>
-      <w:pPr>
-        <w:pStyle w:val="Heading1"/>
-        <w:keepNext/>
-      </w:pPr>
-      <w:r>
-        <w:t>4. Unsupervised learning: what kind of day is it?</w:t>
+        <w:t xml:space="preserve">Figure 7 reports all 39 grid cells. K-means is stable at every k (never below 0.90) and Ward much less so (below the 0.6 goal for most cells); DBSCAN finds structure but pays in noise, because a manifold without density gaps is the wrong problem for it. Silhouette, Davies–Bouldin and Calinski–Harabasz agree, so </w:t>
+      </w:r>
+      <w:r>
+        <w:t>all four metrics pick k=3</w:t>
+      </w:r>
+      <w:r>
+        <w:t>. The chosen configuration, k-means with k=3 on 5 principal components keeping 94.8% of the shape variance, scores ARI 0.996 and silhouette 0.429. Clustering raw megawatts instead gives ARI −0.034 and a cluster that is 92% MISO, so the partition is about shape.</w:t>
       </w:r>
     </w:p>
     <w:p>
@@ -3222,7 +3218,7 @@
         <w:keepNext/>
       </w:pPr>
       <w:r>
-        <w:t>4.1 Choosing the partition</w:t>
+        <w:t>4.2 The three regimes, and the validation that half failed</w:t>
       </w:r>
     </w:p>
     <w:p>
@@ -3231,57 +3227,21 @@
         <w:jc w:val="both"/>
       </w:pPr>
       <w:r>
-        <w:t xml:space="preserve">Figure 7 reports all 39 grid cells. K-means is stable at every k (never below 0.90) and Ward much less so (below the 0.6 goal for most cells); DBSCAN finds structure but pays in noise, because a manifold without density gaps is the wrong problem for it. Silhouette, Davies–Bouldin and Calinski–Harabasz agree, so </w:t>
-      </w:r>
-      <w:r>
-        <w:rPr>
-          <w:b/>
-        </w:rPr>
-        <w:t>all four metrics pick k=3</w:t>
-      </w:r>
-      <w:r>
-        <w:t>. The chosen configuration, k-means with k=3 on 5 principal components keeping 94.8% of the shape variance, scores ARI 0.996 and silhouette 0.429. Clustering raw megawatts instead gives ARI −0.034 and a cluster that is 92% MISO, so the partition is about shape.</w:t>
-      </w:r>
-    </w:p>
-    <w:p>
-      <w:pPr>
-        <w:pStyle w:val="Heading2"/>
-        <w:keepNext/>
-      </w:pPr>
-      <w:r>
-        <w:t>4.2 The three regimes, and the validation that half failed</w:t>
-      </w:r>
-    </w:p>
-    <w:p>
-      <w:pPr>
-        <w:spacing w:after="80" w:line="245" w:lineRule="auto"/>
-        <w:jc w:val="both"/>
-      </w:pPr>
-      <w:r>
         <w:t xml:space="preserve">The centroids (Figure 7d) are three different shapes, not three depths of one shape. </w:t>
       </w:r>
       <w:r>
-        <w:rPr>
-          <w:b/>
-        </w:rPr>
         <w:t>Cluster 2 (n = 2,791, 21.4%) is the duck</w:t>
       </w:r>
       <w:r>
         <w:t xml:space="preserve">: minimum at local hour 13, evening ramp 0.841, the steepest. </w:t>
       </w:r>
       <w:r>
-        <w:rPr>
-          <w:b/>
-        </w:rPr>
         <w:t>Cluster 1 (n = 7,782, 59.5%) is the conventional day</w:t>
       </w:r>
       <w:r>
         <w:t xml:space="preserve">: minimum at hour 4, ramp 0.364. </w:t>
       </w:r>
       <w:r>
-        <w:rPr>
-          <w:b/>
-        </w:rPr>
         <w:t>Cluster 0 (n = 2,496, 19.1%) is winter-shaped</w:t>
       </w:r>
       <w:r>
@@ -3380,13 +3340,18 @@
         <w:t xml:space="preserve">Not one weather column enters the clustering, so weather separating across regimes would be external corroboration. But are the regimes zones in disguise (Figure 8a)? Substantially, yes. </w:t>
       </w:r>
       <w:r>
-        <w:rPr>
-          <w:b/>
-        </w:rPr>
         <w:t>77% of all duck days (2,148 of 2,791) are California's, and 98% of California's days are duck days.</w:t>
       </w:r>
       <w:r>
-        <w:t xml:space="preserve"> Within zone, the winter-shaped regime is colder than its own zone's mean in all five zones with at least thirty such days (by 3.7 to 11.1 °C), which a shape clustering was never told, while the duck's brightness holds in only two of six zones. The temperature signature is physical; the irradiance signature is mostly geography.</w:t>
+        <w:t xml:space="preserve"> Within </w:t>
+      </w:r>
+      <w:proofErr w:type="gramStart"/>
+      <w:r>
+        <w:t>zone</w:t>
+      </w:r>
+      <w:proofErr w:type="gramEnd"/>
+      <w:r>
+        <w:t>, the winter-shaped regime is colder than its own zone's mean in all five zones with at least thirty such days (by 3.7 to 11.1 °C), which a shape clustering was never told, while the duck's brightness holds in only two of six zones. The temperature signature is physical; the irradiance signature is mostly geography.</w:t>
       </w:r>
     </w:p>
     <w:p>
@@ -3472,12 +3437,12 @@
       </w:pPr>
       <w:r>
         <w:lastRenderedPageBreak/>
-        <w:t xml:space="preserve">Adding yesterday's regime label to the champion's pipeline under identical folds (Figure 8b) lowers cross-validated MAE from 2,173.2 to 2,155.8 MW, −17.4 MW (paired p = 0.030); the label two days back gives nothing measurable, and today's own label, a deliberate leak kept as a control, −30.6 MW. The ordering is right and the gain is small, under 1%: the lags already carry most of what a shape label could add. A depth-3 surrogate tree predicting the regime from weather and calendar reaches balanced accuracy 0.627 against chance 0.333, splitting first on temperature. The honest answer to Q3 is that the regimes are stable and physically meaningful in their temperature signature, and useful mainly as a </w:t>
-      </w:r>
-      <w:r>
-        <w:rPr>
-          <w:i/>
-        </w:rPr>
+        <w:t xml:space="preserve">Adding yesterday's regime label to the champion's pipeline under identical folds (Figure 8b) lowers cross-validated MAE from 2,173.2 to 2,155.8 MW, −17.4 MW (paired p = 0.030); the label two days back gives nothing measurable, and today's own label, a deliberate leak kept as a control, −30.6 MW. The ordering is right and the gain is small, under 1%: the lags already carry most of what a shape label could add. A depth-3 surrogate tree predicting the regime from weather and calendar reaches balanced accuracy </w:t>
+      </w:r>
+      <w:r>
+        <w:t xml:space="preserve">0.627 against chance 0.333, splitting first on temperature. The honest answer to Q3 is that the regimes are stable and physically meaningful in their temperature signature, and useful mainly as a </w:t>
+      </w:r>
+      <w:r>
         <w:t>conditioning variable for uncertainty</w:t>
       </w:r>
       <w:r>
@@ -3588,7 +3553,23 @@
         <w:jc w:val="both"/>
       </w:pPr>
       <w:r>
-        <w:t xml:space="preserve">Figure 9 is the supervised result in one picture. Under identical pipeline, folds and gap, cross-validated MAE at h=24 falls from ridge 2,697.9 ± 120.4 MW to random forest 2,237.1 ± 73.7 and histogram gradient boosting 2,173.2 ± 85.5: the large step is linear to non-linear, not forest to booster, and the forest takes 17 times the booster's fit time for the worse score. Tuning takes boosting to 2,107.3 MW. Feature choices matter far more than settings: the selector's k spans 823.3 MW of error, while </w:t>
+        <w:t xml:space="preserve">Figure 9 is the supervised result in one picture. Under identical pipeline, folds and gap, cross-validated MAE at h=24 falls from ridge 2,697.9 ± 120.4 MW to random forest 2,237.1 ± 73.7 and histogram gradient boosting 2,173.2 ± 85.5: the large step is linear to non-linear, not forest to booster, and the forest takes 17 times the booster's fit time for the worse score. </w:t>
+      </w:r>
+      <w:proofErr w:type="gramStart"/>
+      <w:r>
+        <w:t>Tuning takes</w:t>
+      </w:r>
+      <w:proofErr w:type="gramEnd"/>
+      <w:r>
+        <w:t xml:space="preserve"> </w:t>
+      </w:r>
+      <w:proofErr w:type="gramStart"/>
+      <w:r>
+        <w:t>boosting</w:t>
+      </w:r>
+      <w:proofErr w:type="gramEnd"/>
+      <w:r>
+        <w:t xml:space="preserve"> to 2,107.3 MW. Feature choices matter far more than settings: the selector's k spans 823.3 MW of error, while </w:t>
       </w:r>
       <w:r>
         <w:rPr>
@@ -4444,15 +4425,9 @@
         <w:t xml:space="preserve">Table 4 and Figure 11 judge the goals region by region. G1 and G2 are met everywhere. Against the strengthened composite the champion wins in five regions; in New York the composite's 641.1 MW beats the model's 709.7, but the paired interval for that gap, [−60.7, +164.5] MW, contains zero. This is the section's central finding: </w:t>
       </w:r>
       <w:r>
-        <w:rPr>
-          <w:b/>
-        </w:rPr>
         <w:t xml:space="preserve">the model's </w:t>
       </w:r>
       <w:r>
-        <w:rPr>
-          <w:b/>
-        </w:rPr>
         <w:lastRenderedPageBreak/>
         <w:t>advantage is an advantage in forecasting the renewable term.</w:t>
       </w:r>
@@ -5403,7 +5378,14 @@
                 <w:sz w:val="17"/>
                 <w:szCs w:val="17"/>
               </w:rPr>
-              <w:t>−11% (v2: 641.1 MW; paired gap [−60.7, +164.5])</w:t>
+              <w:t>−</w:t>
+            </w:r>
+            <w:r>
+              <w:rPr>
+                <w:sz w:val="17"/>
+                <w:szCs w:val="17"/>
+              </w:rPr>
+              <w:t>11% (v2: 641.1 MW; paired gap [−60.7, +164.5])</w:t>
             </w:r>
           </w:p>
         </w:tc>
@@ -5662,9 +5644,6 @@
         <w:t xml:space="preserve"> 798.3. For a non-specialist, </w:t>
       </w:r>
       <w:r>
-        <w:rPr>
-          <w:b/>
-        </w:rPr>
         <w:t>this is a persistence model with corrections</w:t>
       </w:r>
       <w:r>
@@ -5675,31 +5654,38 @@
         <w:t xml:space="preserve">load tomorrow at 18:00 is net load today at 18:00, and weather and calendar refine it. Ablation answers a different question: removing a family and </w:t>
       </w:r>
       <w:r>
-        <w:rPr>
-          <w:i/>
-        </w:rPr>
         <w:t>refitting</w:t>
       </w:r>
       <w:r>
         <w:t xml:space="preserve"> costs +698.1 MW for weather but only +66.0 MW for the target lags, because refitting leaves near-substitutes standing (lagged demand correlates at about 0.96 with the target). Permutation measures what </w:t>
       </w:r>
       <w:r>
-        <w:rPr>
-          <w:i/>
-        </w:rPr>
         <w:t>this fitted model</w:t>
       </w:r>
       <w:r>
         <w:t xml:space="preserve"> leans on; ablation measures what the model </w:t>
       </w:r>
       <w:r>
-        <w:rPr>
-          <w:i/>
-        </w:rPr>
         <w:t>could not do without</w:t>
       </w:r>
       <w:r>
-        <w:t>, and weather is the family nothing else can reconstruct. The weather family's share of permutation importance rises from 0.9% at h=1 to 10.3% at h=72 as the lag family's falls from 93.9 to 39.9%, the direct test of P5.</w:t>
+        <w:t xml:space="preserve">, and </w:t>
+      </w:r>
+      <w:proofErr w:type="gramStart"/>
+      <w:r>
+        <w:t>weather</w:t>
+      </w:r>
+      <w:proofErr w:type="gramEnd"/>
+      <w:r>
+        <w:t xml:space="preserve"> </w:t>
+      </w:r>
+      <w:proofErr w:type="gramStart"/>
+      <w:r>
+        <w:t>is the family</w:t>
+      </w:r>
+      <w:proofErr w:type="gramEnd"/>
+      <w:r>
+        <w:t xml:space="preserve"> nothing else can reconstruct. The weather family's share of permutation importance rises from 0.9% at h=1 to 10.3% at h=72 as the lag family's falls from 93.9 to 39.9%, the direct test of P5.</w:t>
       </w:r>
     </w:p>
     <w:p>
@@ -5735,7 +5721,15 @@
         <w:t>wind_speed_100m</w:t>
       </w:r>
       <w:r>
-        <w:t xml:space="preserve"> 1,004.2, and the beeswarm (Figure 12b) shows direction as well as size: high yesterday-net-load pushes the forecast up, high hub-height wind pushes it down. Partial-dependence and accumulated-local-effects [9] curves for temperature recover the U, with a flat comfort bottom between about 11.9 °C and 19.6 °C.</w:t>
+        <w:t xml:space="preserve"> 1,004.2, and the beeswarm (Figure 12b) shows direction as well as size: high yesterday-net-load pushes the forecast up, high hub-height wind pushes it down. Partial-dependence and accumulated-local-effects [9] curves for temperature </w:t>
+      </w:r>
+      <w:proofErr w:type="gramStart"/>
+      <w:r>
+        <w:t>recover</w:t>
+      </w:r>
+      <w:proofErr w:type="gramEnd"/>
+      <w:r>
+        <w:t xml:space="preserve"> the U, with a flat comfort bottom between about 11.9 °C and 19.6 °C.</w:t>
       </w:r>
     </w:p>
     <w:p>
@@ -6001,7 +5995,10 @@
         <w:jc w:val="both"/>
       </w:pPr>
       <w:r>
-        <w:t>A classification arm flags hours with more renewable output than the grid can use: renewable share above its zone's 85th percentile and net load below its zone's 15th percentile, a base rate of 15.85%. The classifier reaches PR-AUC 0.772, a 4.9× lift over the base rate (ROC-AUC 0.936); accuracy of 0.905 is the trap, since a model that never predicts curtailment scores 0.841. F1 is 0.674 at a threshold of 0.258 found on the holdout, and therefore optimistic. No feature restates the same-hour label; only lagged copies of its inputs reach the model.</w:t>
+        <w:t>A classification arm flags hours with more renewable output than the grid can use: renewable share above its zone's 85th percentile and net load below its zone's 15th percentile, a base rate of 15.85%. The classifier reaches PR-AUC 0.772, a 4.9× lift over the base rate (ROC-AUC 0.936); accuracy of 0.905 is the trap, since a model that never predicts curtailment scores 0.841. F1 is 0.674 at a threshold of 0.258 found on the holdout, and therefore optimistic. No feature restates the same-hour label; only lagg</w:t>
+      </w:r>
+      <w:r>
+        <w:t>ed copies of its inputs reach the model.</w:t>
       </w:r>
     </w:p>
     <w:p>
@@ -6028,21 +6025,21 @@
         <w:jc w:val="both"/>
       </w:pPr>
       <w:r>
-        <w:t xml:space="preserve">Two intervals are routinely confused. The 90% </w:t>
-      </w:r>
-      <w:r>
-        <w:rPr>
-          <w:i/>
-        </w:rPr>
+        <w:t xml:space="preserve">Two intervals are routinely </w:t>
+      </w:r>
+      <w:r>
+        <w:t>confusing</w:t>
+      </w:r>
+      <w:r>
+        <w:t xml:space="preserve">. The 90% </w:t>
+      </w:r>
+      <w:r>
         <w:t>confidence</w:t>
       </w:r>
       <w:r>
         <w:t xml:space="preserve"> interval for the mean holdout error of the median forecast is [−375.1, −191.8] MW on 1,974 zone-day blocks; the 90% </w:t>
       </w:r>
       <w:r>
-        <w:rPr>
-          <w:i/>
-        </w:rPr>
         <w:t>prediction</w:t>
       </w:r>
       <w:r>
@@ -6067,54 +6064,44 @@
         <w:t xml:space="preserve">The raw quantile model's quantiles </w:t>
       </w:r>
       <w:r>
-        <w:rPr>
-          <w:b/>
-        </w:rPr>
         <w:t>crossed</w:t>
       </w:r>
       <w:r>
         <w:t xml:space="preserve"> on 10.034% of rows, which monotone rearrangement removed; its nominal 90% band </w:t>
       </w:r>
       <w:r>
-        <w:rPr>
-          <w:b/>
-        </w:rPr>
         <w:t>under-covered</w:t>
       </w:r>
       <w:r>
         <w:t xml:space="preserve"> at 80.4%; and its </w:t>
       </w:r>
       <w:r>
-        <w:rPr>
-          <w:b/>
-        </w:rPr>
         <w:t>median was biased</w:t>
       </w:r>
       <w:r>
-        <w:t xml:space="preserve">: 54.1% of outcomes fell below it. Figure 14 scores nine constructions. Every calibrated arm lands inside the ±5-point tolerance at 88.4–88.9% coverage, so the choice is made on width and Winkler score: split conformal is widest and worst (10,594.5 MW, Winkler 15,750.6), and the shipped Mondrian CQR additive scores 8,709.5 MW / 11,545.4. Methods scored on the same hours move together, so every comparison is paired. The G3 scorecard at h=24: coverage </w:t>
-      </w:r>
-      <w:r>
-        <w:rPr>
-          <w:b/>
-        </w:rPr>
+        <w:t xml:space="preserve">: 54.1% of outcomes fell below it. Figure 14 scores nine constructions. Every calibrated arm </w:t>
+      </w:r>
+      <w:proofErr w:type="gramStart"/>
+      <w:r>
+        <w:t>lands</w:t>
+      </w:r>
+      <w:proofErr w:type="gramEnd"/>
+      <w:r>
+        <w:t xml:space="preserve"> inside the ±5-point tolerance at 88.4–88.9% coverage, so the choice is made on width and Winkler score: split conformal is widest and worst (10,594.5 MW, Winkler 15,750.6), and the shipped Mondrian CQR additive scores 8,709.5 MW / 11,545.4. Methods scored on the same hours move together, so every comparison is paired. The G3 scorecard at h=24: coverage </w:t>
+      </w:r>
+      <w:r>
         <w:t>met</w:t>
       </w:r>
       <w:r>
         <w:t xml:space="preserve"> (88.7%), crossings </w:t>
       </w:r>
       <w:r>
-        <w:rPr>
-          <w:b/>
-        </w:rPr>
         <w:t>met</w:t>
       </w:r>
       <w:r>
         <w:t xml:space="preserve"> (10.0% → 0), median </w:t>
       </w:r>
       <w:r>
-        <w:rPr>
-          <w:b/>
-        </w:rPr>
         <w:t>missed</w:t>
       </w:r>
       <w:r>
@@ -6194,7 +6181,14 @@
           <w:sz w:val="18"/>
           <w:szCs w:val="18"/>
         </w:rPr>
-        <w:t>(a) Coverage against mean width for every interval construction, with the nominal 90% dashed and the ±5-point tolerance shaded: the raw band under-covers, every calibrated band reaches the tolerance. (b) 90% coverage per zone, pooled against Mondrian; (c) the fraction of outcomes below the median per zone before and after the shifts, against the 0.500 ± 0.010 band. What to observe: conditioning on zone collapses the coverage spread from 19.6 to 5.0 points, but California's median moves away from 0.5. Source: notebook 08 §8.6; notebook 06 §6.2c (08_coverage_vs_width.png; 06_mondrian_by_zone.png).</w:t>
+        <w:t>(a) Coverage against mean width for every interval construction, with the nominal 90% dashed and the ±5-point tolerance shaded: the raw band under-covers, every calibrated band reaches the tolerance. (b) 90% coverage per zone, pooled against Mondrian; (c) the fraction of outcomes below the median per zone before and after the shifts, against the 0.500 ± 0.010 band. What to observe: conditioning on zone collapses the coverage spread from 19.6 to 5.0 points, but California's median moves away from 0.5. Source</w:t>
+      </w:r>
+      <w:r>
+        <w:rPr>
+          <w:sz w:val="18"/>
+          <w:szCs w:val="18"/>
+        </w:rPr>
+        <w:t>: notebook 08 §8.6; notebook 06 §6.2c (08_coverage_vs_width.png; 06_mondrian_by_zone.png).</w:t>
       </w:r>
     </w:p>
     <w:p>
@@ -6204,30 +6198,29 @@
       </w:pPr>
       <w:r>
         <w:lastRenderedPageBreak/>
-        <w:t xml:space="preserve">Marginal coverage is easy; conditional coverage is the work. The pooled band's 88.4% was an average right for no zone (Figure 14b): 99.5% in Bonneville but 80.0% in Texas, a 19.6-point spread. Conditioning the conformal margin on zone collapses it to 5.0 points, every zone inside the gate. The per-zone margins run from +130.6 MW for Bonneville to +1,610.4 MW for Texas against the single pooled +619.1, and Winkler improved from 12,121 to 11,545 because the width went where the misses were. The median is the most informative failure: Mondrian fixed the zones whose bias was </w:t>
-      </w:r>
-      <w:r>
-        <w:rPr>
-          <w:i/>
-        </w:rPr>
+        <w:t xml:space="preserve">Marginal coverage is easy; conditional coverage is the work. The pooled band's 88.4% was an average right for no zone (Figure 14b): 99.5% in Bonneville but 80.0% in Texas, a 19.6-point spread. Conditioning the conformal margin on zone collapses it to 5.0 points, every zone inside the gate. The per-zone margins </w:t>
+      </w:r>
+      <w:proofErr w:type="gramStart"/>
+      <w:r>
+        <w:t>run</w:t>
+      </w:r>
+      <w:proofErr w:type="gramEnd"/>
+      <w:r>
+        <w:t xml:space="preserve"> from +130.6 MW for Bonneville to +1,610.4 MW for Texas against the single pooled +619.1, and Winkler improved from 12,121 to 11,545 because the width went where the misses were. The median is the most informative failure: Mondrian fixed the zones whose bias was </w:t>
+      </w:r>
+      <w:r>
         <w:t>cross-sectional</w:t>
       </w:r>
       <w:r>
         <w:t xml:space="preserve"> (Bonneville exact at 0.502) and made California </w:t>
       </w:r>
       <w:r>
-        <w:rPr>
-          <w:i/>
-        </w:rPr>
         <w:t>worse</w:t>
       </w:r>
       <w:r>
         <w:t xml:space="preserve">, 0.604 → 0.609, because California's bias is </w:t>
       </w:r>
       <w:r>
-        <w:rPr>
-          <w:i/>
-        </w:rPr>
         <w:t>temporal</w:t>
       </w:r>
       <w:r>
@@ -6252,9 +6245,6 @@
         <w:t xml:space="preserve">A band fitted, calibrated and scored at every horizon on that horizon's own champion reaches Mondrian coverage 85.9% at h=1, 88.8% at h=24, 89.4% at h=48 and 89.7% at h=72, so the conformal correction transfers across lead time. </w:t>
       </w:r>
       <w:r>
-        <w:rPr>
-          <w:b/>
-        </w:rPr>
         <w:t>h=1 is not helped</w:t>
       </w:r>
       <w:r>
@@ -6486,7 +6476,13 @@
         <w:jc w:val="both"/>
       </w:pPr>
       <w:r>
-        <w:t>The question is natural and three designs asked it; the honest answer is that the data cannot settle it. A directed acyclic graph with demand growth, zone characteristics, weather and solar share gives 56 back-door paths from solar share to the evening ramp, 48 of them opened by conditioning on same-hour demand, a collider; the admissible observed set is {demand, humidity, temperature, wind speed}. The naive pooled slope is +582.1 MW of evening ramp per percentage point of solar share. Difference-in-differences (Figure 16a), treating California, Texas and MISO against Bonneville, New York and the Plains at a 2022-01-01 cut-off, passes its pre-trend screen and estimates +2,083.8 MW with a 95% interval of [−856.9, +5,024.4] that contains zero, because the design learns from six groups. Propensity matching of high-solar to low-solar days (Figure 16b) gives +7,180.3 MW with a Rosenbaum Γ [17] of 18.40, but 98.5% of matched pairs are cross-zone, so the hidden confounder is which zone a day belongs to. The designs agree on direction, disagree by a factor of three on size and none identifies it, so the report records a claim withheld rather than a claim made.</w:t>
+        <w:t>The question is natural and three designs asked it; the honest answer is that the data cannot settle it. A directed acyclic graph with demand growth, zone characteristics, weather and solar share gives 56 back-door paths from solar share to the evening ramp, 48 of them opened by conditioning on same-hour demand, a collider; the admissible observed set is {demand, humidity, temperature, wind speed}. The naive pooled slope is +582.1 MW of evening ramp per percentage point of solar share. Difference-in-differe</w:t>
+      </w:r>
+      <w:r>
+        <w:t xml:space="preserve">nces (Figure 16a), treating California, Texas and MISO against Bonneville, New York and the Plains at a 2022-01-01 cut-off, passes its pre-trend screen and estimates +2,083.8 MW with a 95% interval of [−856.9, +5,024.4] that contains zero, because the design learns from six groups. Propensity matching of high-solar to low-solar days (Figure 16b) gives +7,180.3 MW with a Rosenbaum Γ [17] of 18.40, but 98.5% of matched pairs are cross-zone, so the hidden confounder is which zone a day belongs to. The designs </w:t>
+      </w:r>
+      <w:r>
+        <w:t>agree on direction, disagree by a factor of three on size and none identifies it, so the report records a claim withheld rather than a claim made.</w:t>
       </w:r>
     </w:p>
     <w:p>
@@ -6580,7 +6576,10 @@
         <w:t>What surprised, and what went wrong.</w:t>
       </w:r>
       <w:r>
-        <w:t xml:space="preserve"> Mutual information would have deleted useful features; the lag family the model leans on most is nearly replaceable on refit while weather is not; and three defects were found by audit rather than avoided (the fuel columns, the rolling windows, the local-versus-UTC join of the regime labels), each measured before it was fixed. The method is as much the result as the numbers: goals and predictions registered before modelling, a holdout sealed before tuning, every comparison paired and blocked, and every number traced to a ledger.</w:t>
+        <w:t xml:space="preserve"> Mutual information would have deleted useful features; the lag family the model leans on most is nearly replaceable on refit while weather is not; and three defects were found by audit rather than avoided (the fuel columns, the rolling windows, the local-versus-UTC join of the regime labels), each measured before it was fixed. The method is as much the result as the numbers: goals and predictions registered before modelling, a holdout sealed before tuning, every comparison paired and blocked, and every num</w:t>
+      </w:r>
+      <w:r>
+        <w:t>ber traced to a ledger.</w:t>
       </w:r>
     </w:p>
     <w:p>
@@ -8224,13 +8223,7 @@
         <w:t>modelin</w:t>
       </w:r>
       <w:r>
-        <w:t xml:space="preserve">g, </w:t>
-      </w:r>
-      <w:r>
-        <w:t>tuning and evaluation</w:t>
-      </w:r>
-      <w:r>
-        <w:t>,</w:t>
+        <w:t>g, tuning and evaluation,</w:t>
       </w:r>
       <w:r>
         <w:t xml:space="preserve"> </w:t>

</xml_diff>